<commit_message>
updated first deploment on new VPS
</commit_message>
<xml_diff>
--- a/System_Documentation/User_Manual.docx
+++ b/System_Documentation/User_Manual.docx
@@ -1,6 +1,6 @@
 
 <file path=word/document.xml><?xml version="1.0" encoding="utf-8"?>
-<w:document xmlns:w="http://schemas.openxmlformats.org/wordprocessingml/2006/main" xmlns:m="http://schemas.openxmlformats.org/officeDocument/2006/math" xmlns:r="http://schemas.openxmlformats.org/officeDocument/2006/relationships" xmlns:o="urn:schemas-microsoft-com:office:office" xmlns:v="urn:schemas-microsoft-com:vml" xmlns:w10="urn:schemas-microsoft-com:office:word" xmlns:a="http://schemas.openxmlformats.org/drawingml/2006/main" xmlns:pic="http://schemas.openxmlformats.org/drawingml/2006/picture" xmlns:wp="http://schemas.openxmlformats.org/drawingml/2006/wordprocessingDrawing">
+<w:document xmlns:a="http://schemas.openxmlformats.org/drawingml/2006/main" xmlns:wpc="http://schemas.microsoft.com/office/word/2010/wordprocessingCanvas" xmlns:mc="http://schemas.openxmlformats.org/markup-compatibility/2006" xmlns:o="urn:schemas-microsoft-com:office:office" xmlns:pic="http://schemas.openxmlformats.org/drawingml/2006/picture" xmlns:r="http://schemas.openxmlformats.org/officeDocument/2006/relationships" xmlns:m="http://schemas.openxmlformats.org/officeDocument/2006/math" xmlns:v="urn:schemas-microsoft-com:vml" xmlns:wp14="http://schemas.microsoft.com/office/word/2010/wordprocessingDrawing" xmlns:wp="http://schemas.openxmlformats.org/drawingml/2006/wordprocessingDrawing" xmlns:w10="urn:schemas-microsoft-com:office:word" xmlns:w="http://schemas.openxmlformats.org/wordprocessingml/2006/main" xmlns:w14="http://schemas.microsoft.com/office/word/2010/wordml" xmlns:w15="http://schemas.microsoft.com/office/word/2012/wordml" xmlns:w16="http://schemas.microsoft.com/office/word/2018/wordml" xmlns:w16cex="http://schemas.microsoft.com/office/word/2018/wordml/cex" xmlns:w16cid="http://schemas.microsoft.com/office/word/2016/wordml/cid" xmlns:w16sdtdh="http://schemas.microsoft.com/office/word/2020/wordml/sdtdatahash" xmlns:w16se="http://schemas.microsoft.com/office/word/2015/wordml/symex" xmlns:wpg="http://schemas.microsoft.com/office/word/2010/wordprocessingGroup" xmlns:wps="http://schemas.microsoft.com/office/word/2010/wordprocessingShape" mc:Ignorable="wp14 w14 w15 w16 w16cex w16cid w16sdtdh w16se">
   <w:body>
     <w:bookmarkStart w:id="25" w:name="X71ba3f1c2c335c9aca1e4c3e0ff5f112421d770"/>
     <w:p>
@@ -8,25 +8,22 @@
         <w:pStyle w:val="Heading1"/>
       </w:pPr>
       <w:r>
-        <w:t xml:space="preserve">Prison Management System: Operational User Manual</w:t>
-      </w:r>
-    </w:p>
-    <w:p>
-      <w:pPr>
-        <w:pStyle w:val="FirstParagraph"/>
-      </w:pPr>
-      <w:r>
-        <w:rPr>
-          <w:b/>
-          <w:bCs/>
-        </w:rPr>
-        <w:t xml:space="preserve">Version:</w:t>
-      </w:r>
-      <w:r>
-        <w:t xml:space="preserve"> </w:t>
-      </w:r>
-      <w:r>
-        <w:t xml:space="preserve">1.0</w:t>
+        <w:t>Prison Management System: Operational User Manual</w:t>
+      </w:r>
+    </w:p>
+    <w:p>
+      <w:pPr>
+        <w:pStyle w:val="FirstParagraph"/>
+      </w:pPr>
+      <w:r>
+        <w:rPr>
+          <w:b/>
+          <w:bCs/>
+        </w:rPr>
+        <w:t>Version:</w:t>
+      </w:r>
+      <w:r>
+        <w:t xml:space="preserve"> 1.0</w:t>
       </w:r>
       <w:r>
         <w:br/>
@@ -36,13 +33,10 @@
           <w:b/>
           <w:bCs/>
         </w:rPr>
-        <w:t xml:space="preserve">Target Audience:</w:t>
-      </w:r>
-      <w:r>
-        <w:t xml:space="preserve"> </w:t>
-      </w:r>
-      <w:r>
-        <w:t xml:space="preserve">System Administrators, Officers, and Operational Staff</w:t>
+        <w:t>Target Audience:</w:t>
+      </w:r>
+      <w:r>
+        <w:t xml:space="preserve"> System Administrators, Officers, and Operational Staff</w:t>
       </w:r>
       <w:r>
         <w:br/>
@@ -52,18 +46,15 @@
           <w:b/>
           <w:bCs/>
         </w:rPr>
-        <w:t xml:space="preserve">Purpose:</w:t>
-      </w:r>
-      <w:r>
-        <w:t xml:space="preserve"> </w:t>
-      </w:r>
-      <w:r>
-        <w:t xml:space="preserve">A comprehensive, professional guide on utilizing the Prison Management System (PMS), covering system setup, user management, workflows, and operational protocols.</w:t>
-      </w:r>
-    </w:p>
-    <w:p>
-      <w:r>
-        <w:pict>
+        <w:t>Purpose:</w:t>
+      </w:r>
+      <w:r>
+        <w:t xml:space="preserve"> A comprehensive, professional guide on utilizing the Prison Management System (PMS), covering system setup, user management, workflows, and operational protocols.</w:t>
+      </w:r>
+    </w:p>
+    <w:p>
+      <w:r>
+        <w:pict xmlns:w="http://schemas.openxmlformats.org/wordprocessingml/2006/main" xmlns:v="urn:schemas-microsoft-com:vml" xmlns:o="urn:schemas-microsoft-com:office:office">
           <v:rect style="width:0;height:1.5pt" o:hralign="center" o:hrstd="t" o:hr="t"/>
         </w:pict>
       </w:r>
@@ -74,15 +65,15 @@
         <w:pStyle w:val="Heading2"/>
       </w:pPr>
       <w:r>
-        <w:t xml:space="preserve">1. System Setup and Pilot Program Activation</w:t>
-      </w:r>
-    </w:p>
-    <w:p>
-      <w:pPr>
-        <w:pStyle w:val="FirstParagraph"/>
-      </w:pPr>
-      <w:r>
-        <w:t xml:space="preserve">The deployment of the Prison Management System follows a strict, top-down initialization sequence to maintain the integrity of the 3-tier organizational hierarchy.</w:t>
+        <w:t>1. System Setup and Pilot Program Activation</w:t>
+      </w:r>
+    </w:p>
+    <w:p>
+      <w:pPr>
+        <w:pStyle w:val="FirstParagraph"/>
+      </w:pPr>
+      <w:r>
+        <w:t>The deployment of the Prison Management System follows a strict, top-down initialization sequence to maintain the integrity of the 3-tier organizational hierarchy.</w:t>
       </w:r>
     </w:p>
     <w:bookmarkStart w:id="9" w:name="the-order-of-events-pilot-program-flow"/>
@@ -91,7 +82,7 @@
         <w:pStyle w:val="Heading3"/>
       </w:pPr>
       <w:r>
-        <w:t xml:space="preserve">1.1 The Order of Events (Pilot Program Flow)</w:t>
+        <w:t>1.1 The Order of Events (Pilot Program Flow)</w:t>
       </w:r>
     </w:p>
     <w:p>
@@ -107,28 +98,19 @@
           <w:b/>
           <w:bCs/>
         </w:rPr>
-        <w:t xml:space="preserve">System Initialization:</w:t>
-      </w:r>
-      <w:r>
-        <w:t xml:space="preserve"> </w:t>
-      </w:r>
-      <w:r>
-        <w:t xml:space="preserve">The database begins in an</w:t>
-      </w:r>
-      <w:r>
-        <w:t xml:space="preserve"> </w:t>
+        <w:t>System Initialization:</w:t>
+      </w:r>
+      <w:r>
+        <w:t xml:space="preserve"> The database begins in an </w:t>
       </w:r>
       <w:r>
         <w:rPr>
           <w:rStyle w:val="VerbatimChar"/>
         </w:rPr>
-        <w:t xml:space="preserve">UNINITIALIZED</w:t>
-      </w:r>
-      <w:r>
-        <w:t xml:space="preserve"> </w:t>
-      </w:r>
-      <w:r>
-        <w:t xml:space="preserve">state.</w:t>
+        <w:t>UNINITIALIZED</w:t>
+      </w:r>
+      <w:r>
+        <w:t xml:space="preserve"> state.</w:t>
       </w:r>
     </w:p>
     <w:p>
@@ -144,29 +126,20 @@
           <w:b/>
           <w:bCs/>
         </w:rPr>
-        <w:t xml:space="preserve">National HQ Creation:</w:t>
-      </w:r>
-      <w:r>
-        <w:t xml:space="preserve"> </w:t>
-      </w:r>
-      <w:r>
-        <w:t xml:space="preserve">The setup wizard establishes the National Headquarters (OrgUnit) and creates the first</w:t>
-      </w:r>
-      <w:r>
-        <w:t xml:space="preserve"> </w:t>
-      </w:r>
-      <w:r>
-        <w:rPr>
-          <w:b/>
-          <w:bCs/>
-        </w:rPr>
-        <w:t xml:space="preserve">National HQ System Admin</w:t>
-      </w:r>
-      <w:r>
-        <w:t xml:space="preserve"> </w:t>
-      </w:r>
-      <w:r>
-        <w:t xml:space="preserve">(Super Admin).</w:t>
+        <w:t>National HQ Creation:</w:t>
+      </w:r>
+      <w:r>
+        <w:t xml:space="preserve"> The setup wizard establishes the National Headquarters (OrgUnit) and creates the first </w:t>
+      </w:r>
+      <w:r>
+        <w:rPr>
+          <w:b/>
+          <w:bCs/>
+        </w:rPr>
+        <w:t>National HQ System Admin</w:t>
+      </w:r>
+      <w:r>
+        <w:t xml:space="preserve"> (Super Admin).</w:t>
       </w:r>
     </w:p>
     <w:p>
@@ -182,13 +155,10 @@
           <w:b/>
           <w:bCs/>
         </w:rPr>
-        <w:t xml:space="preserve">Provincial Setup:</w:t>
-      </w:r>
-      <w:r>
-        <w:t xml:space="preserve"> </w:t>
-      </w:r>
-      <w:r>
-        <w:t xml:space="preserve">The National Admin logs in and creates the initial Provincial Command Centers for the pilot regions.</w:t>
+        <w:t>Provincial Setup:</w:t>
+      </w:r>
+      <w:r>
+        <w:t xml:space="preserve"> The National Admin logs in and creates the initial Provincial Command Centers for the pilot regions.</w:t>
       </w:r>
     </w:p>
     <w:p>
@@ -204,13 +174,10 @@
           <w:b/>
           <w:bCs/>
         </w:rPr>
-        <w:t xml:space="preserve">Provincial Admin Provisioning:</w:t>
-      </w:r>
-      <w:r>
-        <w:t xml:space="preserve"> </w:t>
-      </w:r>
-      <w:r>
-        <w:t xml:space="preserve">The National Admin registers the Provincial Admins for the newly created provinces.</w:t>
+        <w:t>Provincial Admin Provisioning:</w:t>
+      </w:r>
+      <w:r>
+        <w:t xml:space="preserve"> The National Admin registers the Provincial Admins for the newly created provinces.</w:t>
       </w:r>
     </w:p>
     <w:p>
@@ -226,13 +193,10 @@
           <w:b/>
           <w:bCs/>
         </w:rPr>
-        <w:t xml:space="preserve">Station Setup:</w:t>
-      </w:r>
-      <w:r>
-        <w:t xml:space="preserve"> </w:t>
-      </w:r>
-      <w:r>
-        <w:t xml:space="preserve">Provincial Admins log into their respective dashboards and create the physical Prison Stations under their jurisdiction.</w:t>
+        <w:t>Station Setup:</w:t>
+      </w:r>
+      <w:r>
+        <w:t xml:space="preserve"> Provincial Admins log into their respective dashboards and create the physical Prison Stations under their jurisdiction.</w:t>
       </w:r>
     </w:p>
     <w:p>
@@ -248,13 +212,10 @@
           <w:b/>
           <w:bCs/>
         </w:rPr>
-        <w:t xml:space="preserve">Station Admin Provisioning:</w:t>
-      </w:r>
-      <w:r>
-        <w:t xml:space="preserve"> </w:t>
-      </w:r>
-      <w:r>
-        <w:t xml:space="preserve">Provincial Admins register Station Admins to run the newly created stations.</w:t>
+        <w:t>Station Admin Provisioning:</w:t>
+      </w:r>
+      <w:r>
+        <w:t xml:space="preserve"> Provincial Admins register Station Admins to run the newly created stations.</w:t>
       </w:r>
     </w:p>
     <w:p>
@@ -270,14 +231,20 @@
           <w:b/>
           <w:bCs/>
         </w:rPr>
-        <w:t xml:space="preserve">Officer Onboarding:</w:t>
-      </w:r>
-      <w:r>
-        <w:t xml:space="preserve"> </w:t>
-      </w:r>
-      <w:r>
-        <w:t xml:space="preserve">Station Admins register departmental staff (Reception, Health, Stores, etc.) to begin daily operations.</w:t>
-      </w:r>
+        <w:t>Officer Onboarding:</w:t>
+      </w:r>
+      <w:r>
+        <w:t xml:space="preserve"> Station Admins register departmental staff (Reception, Health, Stores, etc.) to begin daily operations.</w:t>
+      </w:r>
+    </w:p>
+    <w:p>
+      <w:pPr>
+        <w:pStyle w:val="Compact"/>
+        <w:numPr>
+          <w:ilvl w:val="0"/>
+          <w:numId w:val="1001"/>
+        </w:numPr>
+      </w:pPr>
     </w:p>
     <w:bookmarkEnd w:id="9"/>
     <w:bookmarkStart w:id="10" w:name="the-national-hq-system-admin"/>
@@ -286,19 +253,19 @@
         <w:pStyle w:val="Heading3"/>
       </w:pPr>
       <w:r>
-        <w:t xml:space="preserve">1.2 The National HQ System Admin</w:t>
-      </w:r>
-    </w:p>
-    <w:p>
-      <w:pPr>
-        <w:pStyle w:val="FirstParagraph"/>
-      </w:pPr>
-      <w:r>
-        <w:rPr>
-          <w:b/>
-          <w:bCs/>
-        </w:rPr>
-        <w:t xml:space="preserve">Role:</w:t>
+        <w:t>1.2 The National HQ System Admin</w:t>
+      </w:r>
+    </w:p>
+    <w:p>
+      <w:pPr>
+        <w:pStyle w:val="FirstParagraph"/>
+      </w:pPr>
+      <w:r>
+        <w:rPr>
+          <w:b/>
+          <w:bCs/>
+        </w:rPr>
+        <w:t>Role:</w:t>
       </w:r>
       <w:r>
         <w:t xml:space="preserve"> </w:t>
@@ -307,28 +274,19 @@
         <w:rPr>
           <w:rStyle w:val="VerbatimChar"/>
         </w:rPr>
-        <w:t xml:space="preserve">SUPER_ADMIN</w:t>
-      </w:r>
-      <w:r>
-        <w:t xml:space="preserve"> </w:t>
-      </w:r>
-      <w:r>
-        <w:t xml:space="preserve">/</w:t>
-      </w:r>
-      <w:r>
-        <w:t xml:space="preserve"> </w:t>
+        <w:t>SUPER_ADMIN</w:t>
+      </w:r>
+      <w:r>
+        <w:t xml:space="preserve"> / </w:t>
       </w:r>
       <w:r>
         <w:rPr>
           <w:rStyle w:val="VerbatimChar"/>
         </w:rPr>
-        <w:t xml:space="preserve">ADMIN_OFFICER</w:t>
-      </w:r>
-      <w:r>
-        <w:t xml:space="preserve"> </w:t>
-      </w:r>
-      <w:r>
-        <w:t xml:space="preserve">at National HQ.</w:t>
+        <w:t>ADMIN_OFFICER</w:t>
+      </w:r>
+      <w:r>
+        <w:t xml:space="preserve"> at National HQ.</w:t>
       </w:r>
       <w:r>
         <w:br/>
@@ -338,125 +296,71 @@
           <w:b/>
           <w:bCs/>
         </w:rPr>
-        <w:t xml:space="preserve">Responsibilities:</w:t>
-      </w:r>
-      <w:r>
-        <w:t xml:space="preserve"> </w:t>
-      </w:r>
-      <w:r>
-        <w:t xml:space="preserve">*</w:t>
-      </w:r>
-      <w:r>
-        <w:t xml:space="preserve"> </w:t>
-      </w:r>
-      <w:r>
-        <w:rPr>
-          <w:b/>
-          <w:bCs/>
-        </w:rPr>
-        <w:t xml:space="preserve">System-wide Governance:</w:t>
-      </w:r>
-      <w:r>
-        <w:t xml:space="preserve"> </w:t>
-      </w:r>
-      <w:r>
-        <w:t xml:space="preserve">Defines data exposure policies across the entire nation.</w:t>
-      </w:r>
-      <w:r>
-        <w:t xml:space="preserve"> </w:t>
-      </w:r>
-      <w:r>
-        <w:t xml:space="preserve">*</w:t>
-      </w:r>
-      <w:r>
-        <w:t xml:space="preserve"> </w:t>
-      </w:r>
-      <w:r>
-        <w:rPr>
-          <w:b/>
-          <w:bCs/>
-        </w:rPr>
-        <w:t xml:space="preserve">Provincial Management:</w:t>
-      </w:r>
-      <w:r>
-        <w:t xml:space="preserve"> </w:t>
-      </w:r>
-      <w:r>
-        <w:t xml:space="preserve">Exclusively responsible for creating</w:t>
-      </w:r>
-      <w:r>
-        <w:t xml:space="preserve"> </w:t>
+        <w:t>Responsibilities:</w:t>
+      </w:r>
+      <w:r>
+        <w:t xml:space="preserve"> * </w:t>
+      </w:r>
+      <w:r>
+        <w:rPr>
+          <w:b/>
+          <w:bCs/>
+        </w:rPr>
+        <w:t>System-wide Governance:</w:t>
+      </w:r>
+      <w:r>
+        <w:t xml:space="preserve"> Defines data exposure policies across the entire nation. * </w:t>
+      </w:r>
+      <w:r>
+        <w:rPr>
+          <w:b/>
+          <w:bCs/>
+        </w:rPr>
+        <w:t>Provincial Management:</w:t>
+      </w:r>
+      <w:r>
+        <w:t xml:space="preserve"> Exclusively responsible for creating </w:t>
       </w:r>
       <w:r>
         <w:rPr>
           <w:rStyle w:val="VerbatimChar"/>
         </w:rPr>
-        <w:t xml:space="preserve">PROVINCIAL_HQ</w:t>
-      </w:r>
-      <w:r>
-        <w:t xml:space="preserve"> </w:t>
-      </w:r>
-      <w:r>
-        <w:t xml:space="preserve">organizational units and provisioning Provincial Admins.</w:t>
-      </w:r>
-      <w:r>
-        <w:t xml:space="preserve"> </w:t>
-      </w:r>
-      <w:r>
-        <w:t xml:space="preserve">*</w:t>
-      </w:r>
-      <w:r>
-        <w:t xml:space="preserve"> </w:t>
-      </w:r>
-      <w:r>
-        <w:rPr>
-          <w:b/>
-          <w:bCs/>
-        </w:rPr>
-        <w:t xml:space="preserve">Global Configuration:</w:t>
-      </w:r>
-      <w:r>
-        <w:t xml:space="preserve"> </w:t>
-      </w:r>
-      <w:r>
-        <w:t xml:space="preserve">Manages system-wide departments, standardizes classification codes, and oversees system audits.</w:t>
-      </w:r>
-      <w:r>
-        <w:t xml:space="preserve"> </w:t>
-      </w:r>
-      <w:r>
-        <w:t xml:space="preserve">*</w:t>
-      </w:r>
-      <w:r>
-        <w:t xml:space="preserve"> </w:t>
-      </w:r>
-      <w:r>
-        <w:rPr>
-          <w:b/>
-          <w:bCs/>
-        </w:rPr>
-        <w:t xml:space="preserve">Reporting:</w:t>
-      </w:r>
-      <w:r>
-        <w:t xml:space="preserve"> </w:t>
-      </w:r>
-      <w:r>
-        <w:t xml:space="preserve">Accesses aggregated, system-wide analytics (e.g., national population statistics, overall health metrics).</w:t>
-      </w:r>
-      <w:r>
-        <w:t xml:space="preserve"> </w:t>
+        <w:t>PROVINCIAL_HQ</w:t>
+      </w:r>
+      <w:r>
+        <w:t xml:space="preserve"> organizational units and provisioning Provincial Admins. * </w:t>
+      </w:r>
+      <w:r>
+        <w:rPr>
+          <w:b/>
+          <w:bCs/>
+        </w:rPr>
+        <w:t>Global Configuration:</w:t>
+      </w:r>
+      <w:r>
+        <w:t xml:space="preserve"> Manages system-wide departments, standardizes classification codes, and oversees system audits. * </w:t>
+      </w:r>
+      <w:r>
+        <w:rPr>
+          <w:b/>
+          <w:bCs/>
+        </w:rPr>
+        <w:t>Reporting:</w:t>
+      </w:r>
+      <w:r>
+        <w:t xml:space="preserve"> Accesses aggregated, system-wide analytics (e.g., national population statistics, overall health metrics). </w:t>
       </w:r>
       <w:r>
         <w:rPr>
           <w:i/>
           <w:iCs/>
         </w:rPr>
-        <w:t xml:space="preserve">Note: The National Admin cannot natively view individual inmate records unless explicitly exposed via a Data Exposure Policy.</w:t>
-      </w:r>
-    </w:p>
-    <w:p>
-      <w:r>
-        <w:pict>
+        <w:t>Note: The National Admin cannot natively view individual inmate records unless explicitly exposed via a Data Exposure Policy.</w:t>
+      </w:r>
+    </w:p>
+    <w:p>
+      <w:r>
+        <w:pict xmlns:w="http://schemas.openxmlformats.org/wordprocessingml/2006/main" xmlns:v="urn:schemas-microsoft-com:vml" xmlns:o="urn:schemas-microsoft-com:office:office">
           <v:rect style="width:0;height:1.5pt" o:hralign="center" o:hrstd="t" o:hr="t"/>
         </w:pict>
       </w:r>
@@ -469,7 +373,7 @@
         <w:pStyle w:val="Heading2"/>
       </w:pPr>
       <w:r>
-        <w:t xml:space="preserve">2. Organization and User Management</w:t>
+        <w:t>2. Organization and User Management</w:t>
       </w:r>
     </w:p>
     <w:bookmarkStart w:id="12" w:name="how-to-add-a-department"/>
@@ -478,105 +382,101 @@
         <w:pStyle w:val="Heading3"/>
       </w:pPr>
       <w:r>
-        <w:t xml:space="preserve">2.1 How to Add a Department</w:t>
-      </w:r>
-    </w:p>
-    <w:p>
-      <w:pPr>
-        <w:pStyle w:val="FirstParagraph"/>
-      </w:pPr>
-      <w:r>
-        <w:t xml:space="preserve">Departments (e.g., Reception, Health, HR) are globally standardized to ensure consistent reporting.</w:t>
-      </w:r>
-      <w:r>
-        <w:t xml:space="preserve"> </w:t>
-      </w:r>
-      <w:r>
-        <w:t xml:space="preserve">1. The</w:t>
-      </w:r>
-      <w:r>
-        <w:t xml:space="preserve"> </w:t>
-      </w:r>
-      <w:r>
-        <w:rPr>
-          <w:b/>
-          <w:bCs/>
-        </w:rPr>
-        <w:t xml:space="preserve">National Admin</w:t>
-      </w:r>
-      <w:r>
-        <w:t xml:space="preserve"> </w:t>
-      </w:r>
-      <w:r>
-        <w:t xml:space="preserve">navigates to</w:t>
-      </w:r>
-      <w:r>
-        <w:t xml:space="preserve"> </w:t>
+        <w:t>2.1 How to Add a Department</w:t>
+      </w:r>
+    </w:p>
+    <w:p>
+      <w:pPr>
+        <w:pStyle w:val="FirstParagraph"/>
+      </w:pPr>
+      <w:r>
+        <w:t xml:space="preserve">Departments (e.g., Reception, Health, HR) are globally standardized to ensure consistent reporting. </w:t>
+      </w:r>
+    </w:p>
+    <w:p>
+      <w:pPr>
+        <w:pStyle w:val="FirstParagraph"/>
+      </w:pPr>
+      <w:r>
+        <w:t xml:space="preserve">1. The </w:t>
+      </w:r>
+      <w:r>
+        <w:rPr>
+          <w:b/>
+          <w:bCs/>
+        </w:rPr>
+        <w:t>National Admin</w:t>
+      </w:r>
+      <w:r>
+        <w:t xml:space="preserve"> navigates to </w:t>
       </w:r>
       <w:r>
         <w:rPr>
           <w:rStyle w:val="VerbatimChar"/>
         </w:rPr>
-        <w:t xml:space="preserve">System Configuration &gt; Departments</w:t>
-      </w:r>
-      <w:r>
-        <w:t xml:space="preserve">.</w:t>
-      </w:r>
-      <w:r>
-        <w:t xml:space="preserve"> </w:t>
-      </w:r>
-      <w:r>
-        <w:t xml:space="preserve">2. Clicks</w:t>
-      </w:r>
-      <w:r>
-        <w:t xml:space="preserve"> </w:t>
-      </w:r>
-      <w:r>
-        <w:rPr>
-          <w:b/>
-          <w:bCs/>
-        </w:rPr>
-        <w:t xml:space="preserve">Add New Department</w:t>
-      </w:r>
-      <w:r>
-        <w:t xml:space="preserve">.</w:t>
-      </w:r>
-      <w:r>
-        <w:t xml:space="preserve"> </w:t>
-      </w:r>
-      <w:r>
-        <w:t xml:space="preserve">3. Enters the Department Code (e.g.,</w:t>
-      </w:r>
-      <w:r>
-        <w:t xml:space="preserve"> </w:t>
+        <w:t>System Configuration &gt; Departments</w:t>
+      </w:r>
+      <w:r>
+        <w:t>.</w:t>
+      </w:r>
+    </w:p>
+    <w:p>
+      <w:pPr>
+        <w:pStyle w:val="FirstParagraph"/>
+      </w:pPr>
+      <w:r>
+        <w:t xml:space="preserve">2. Clicks </w:t>
+      </w:r>
+      <w:r>
+        <w:rPr>
+          <w:b/>
+          <w:bCs/>
+        </w:rPr>
+        <w:t>Add New Department</w:t>
+      </w:r>
+      <w:r>
+        <w:t xml:space="preserve">. </w:t>
+      </w:r>
+    </w:p>
+    <w:p>
+      <w:pPr>
+        <w:pStyle w:val="FirstParagraph"/>
+      </w:pPr>
+      <w:r>
+        <w:t xml:space="preserve">3. Enters the Department Code (e.g., </w:t>
       </w:r>
       <w:r>
         <w:rPr>
           <w:rStyle w:val="VerbatimChar"/>
         </w:rPr>
-        <w:t xml:space="preserve">EDUCATION</w:t>
-      </w:r>
-      <w:r>
-        <w:t xml:space="preserve">), Name (e.g.,</w:t>
-      </w:r>
-      <w:r>
-        <w:t xml:space="preserve"> </w:t>
+        <w:t>EDUCATION</w:t>
+      </w:r>
+      <w:r>
+        <w:t xml:space="preserve">), Name (e.g., </w:t>
       </w:r>
       <w:r>
         <w:rPr>
           <w:rStyle w:val="VerbatimChar"/>
         </w:rPr>
-        <w:t xml:space="preserve">Rehabilitation &amp; Education</w:t>
-      </w:r>
-      <w:r>
-        <w:t xml:space="preserve">), and Description.</w:t>
-      </w:r>
-      <w:r>
-        <w:t xml:space="preserve"> </w:t>
-      </w:r>
-      <w:r>
-        <w:t xml:space="preserve">4. Saves the department, making it available to be activated at any Provincial HQ or Station.</w:t>
-      </w:r>
+        <w:t>Rehabilitation &amp; Education</w:t>
+      </w:r>
+      <w:r>
+        <w:t xml:space="preserve">), and Description. </w:t>
+      </w:r>
+    </w:p>
+    <w:p>
+      <w:pPr>
+        <w:pStyle w:val="FirstParagraph"/>
+      </w:pPr>
+      <w:r>
+        <w:t>4. Saves the department, making it available to be activated at any Provincial HQ or Station.</w:t>
+      </w:r>
+    </w:p>
+    <w:p>
+      <w:pPr>
+        <w:pStyle w:val="BodyText"/>
+        <w:spacing w:before="180" w:after="180"/>
+      </w:pPr>
     </w:p>
     <w:bookmarkEnd w:id="12"/>
     <w:bookmarkStart w:id="13" w:name="how-to-add-a-station"/>
@@ -585,134 +485,121 @@
         <w:pStyle w:val="Heading3"/>
       </w:pPr>
       <w:r>
-        <w:t xml:space="preserve">2.2 How to Add a Station</w:t>
-      </w:r>
-    </w:p>
-    <w:p>
-      <w:pPr>
-        <w:pStyle w:val="FirstParagraph"/>
-      </w:pPr>
-      <w:r>
-        <w:t xml:space="preserve">Stations are created by the</w:t>
-      </w:r>
-      <w:r>
-        <w:t xml:space="preserve"> </w:t>
-      </w:r>
-      <w:r>
-        <w:rPr>
-          <w:b/>
-          <w:bCs/>
-        </w:rPr>
-        <w:t xml:space="preserve">Provincial Admin</w:t>
-      </w:r>
-      <w:r>
-        <w:t xml:space="preserve"> </w:t>
-      </w:r>
-      <w:r>
-        <w:t xml:space="preserve">for their specific province.</w:t>
-      </w:r>
-      <w:r>
-        <w:t xml:space="preserve"> </w:t>
-      </w:r>
-      <w:r>
-        <w:t xml:space="preserve">1. The</w:t>
-      </w:r>
-      <w:r>
-        <w:t xml:space="preserve"> </w:t>
-      </w:r>
-      <w:r>
-        <w:rPr>
-          <w:b/>
-          <w:bCs/>
-        </w:rPr>
-        <w:t xml:space="preserve">Provincial Admin</w:t>
-      </w:r>
-      <w:r>
-        <w:t xml:space="preserve"> </w:t>
-      </w:r>
-      <w:r>
-        <w:t xml:space="preserve">navigates to</w:t>
-      </w:r>
-      <w:r>
-        <w:t xml:space="preserve"> </w:t>
+        <w:t>2.2 How to Add a Station</w:t>
+      </w:r>
+    </w:p>
+    <w:p>
+      <w:pPr>
+        <w:pStyle w:val="FirstParagraph"/>
+      </w:pPr>
+      <w:r>
+        <w:t xml:space="preserve">Stations are created by the </w:t>
+      </w:r>
+      <w:r>
+        <w:rPr>
+          <w:b/>
+          <w:bCs/>
+        </w:rPr>
+        <w:t>Provincial Admin</w:t>
+      </w:r>
+      <w:r>
+        <w:t xml:space="preserve"> for their specific province. </w:t>
+      </w:r>
+    </w:p>
+    <w:p>
+      <w:pPr>
+        <w:pStyle w:val="FirstParagraph"/>
+      </w:pPr>
+      <w:r>
+        <w:t xml:space="preserve">1. The </w:t>
+      </w:r>
+      <w:r>
+        <w:rPr>
+          <w:b/>
+          <w:bCs/>
+        </w:rPr>
+        <w:t>Provincial Admin</w:t>
+      </w:r>
+      <w:r>
+        <w:t xml:space="preserve"> navigates to </w:t>
       </w:r>
       <w:r>
         <w:rPr>
           <w:rStyle w:val="VerbatimChar"/>
         </w:rPr>
-        <w:t xml:space="preserve">Organization &gt; Stations</w:t>
-      </w:r>
-      <w:r>
-        <w:t xml:space="preserve">.</w:t>
-      </w:r>
-      <w:r>
-        <w:t xml:space="preserve"> </w:t>
-      </w:r>
-      <w:r>
-        <w:t xml:space="preserve">2. Clicks</w:t>
-      </w:r>
-      <w:r>
-        <w:t xml:space="preserve"> </w:t>
-      </w:r>
-      <w:r>
-        <w:rPr>
-          <w:b/>
-          <w:bCs/>
-        </w:rPr>
-        <w:t xml:space="preserve">Add Station</w:t>
-      </w:r>
-      <w:r>
-        <w:t xml:space="preserve">.</w:t>
-      </w:r>
-      <w:r>
-        <w:t xml:space="preserve"> </w:t>
-      </w:r>
-      <w:r>
-        <w:t xml:space="preserve">3. Enters the Station Code (e.g.,</w:t>
-      </w:r>
-      <w:r>
-        <w:t xml:space="preserve"> </w:t>
+        <w:t>Organization &gt; Stations</w:t>
+      </w:r>
+      <w:r>
+        <w:t xml:space="preserve">. </w:t>
+      </w:r>
+    </w:p>
+    <w:p>
+      <w:pPr>
+        <w:pStyle w:val="FirstParagraph"/>
+      </w:pPr>
+      <w:r>
+        <w:t xml:space="preserve">2. Clicks </w:t>
+      </w:r>
+      <w:r>
+        <w:rPr>
+          <w:b/>
+          <w:bCs/>
+        </w:rPr>
+        <w:t>Add Station</w:t>
+      </w:r>
+      <w:r>
+        <w:t xml:space="preserve">. </w:t>
+      </w:r>
+    </w:p>
+    <w:p>
+      <w:pPr>
+        <w:pStyle w:val="FirstParagraph"/>
+      </w:pPr>
+      <w:r>
+        <w:t xml:space="preserve">3. Enters the Station Code (e.g., </w:t>
       </w:r>
       <w:r>
         <w:rPr>
           <w:rStyle w:val="VerbatimChar"/>
         </w:rPr>
-        <w:t xml:space="preserve">HRE_CNTRL</w:t>
-      </w:r>
-      <w:r>
-        <w:t xml:space="preserve">), Name (e.g.,</w:t>
-      </w:r>
-      <w:r>
-        <w:t xml:space="preserve"> </w:t>
+        <w:t>HRE_CNTRL</w:t>
+      </w:r>
+      <w:r>
+        <w:t xml:space="preserve">), Name (e.g., </w:t>
       </w:r>
       <w:r>
         <w:rPr>
           <w:rStyle w:val="VerbatimChar"/>
         </w:rPr>
-        <w:t xml:space="preserve">Harare Central Prison</w:t>
-      </w:r>
-      <w:r>
-        <w:t xml:space="preserve">), physical location, and selects the parent Province.</w:t>
-      </w:r>
-      <w:r>
-        <w:t xml:space="preserve"> </w:t>
-      </w:r>
-      <w:r>
-        <w:t xml:space="preserve">4. Clicks</w:t>
-      </w:r>
-      <w:r>
-        <w:t xml:space="preserve"> </w:t>
-      </w:r>
-      <w:r>
-        <w:rPr>
-          <w:b/>
-          <w:bCs/>
-        </w:rPr>
-        <w:t xml:space="preserve">Create</w:t>
-      </w:r>
-      <w:r>
-        <w:t xml:space="preserve">. The station is now active and ready for a Station Admin.</w:t>
-      </w:r>
+        <w:t>Harare Central Prison</w:t>
+      </w:r>
+      <w:r>
+        <w:t xml:space="preserve">), physical location, and selects the parent Province. </w:t>
+      </w:r>
+    </w:p>
+    <w:p>
+      <w:pPr>
+        <w:pStyle w:val="FirstParagraph"/>
+      </w:pPr>
+      <w:r>
+        <w:t xml:space="preserve">4. Clicks </w:t>
+      </w:r>
+      <w:r>
+        <w:rPr>
+          <w:b/>
+          <w:bCs/>
+        </w:rPr>
+        <w:t>Create</w:t>
+      </w:r>
+      <w:r>
+        <w:t>. The station is now active and ready for a Station Admin.</w:t>
+      </w:r>
+    </w:p>
+    <w:p>
+      <w:pPr>
+        <w:pStyle w:val="BodyText"/>
+        <w:spacing w:before="180" w:after="180"/>
+      </w:pPr>
     </w:p>
     <w:bookmarkEnd w:id="13"/>
     <w:bookmarkStart w:id="14" w:name="how-to-add-a-station-admin"/>
@@ -721,7 +608,7 @@
         <w:pStyle w:val="Heading3"/>
       </w:pPr>
       <w:r>
-        <w:t xml:space="preserve">2.3 How to Add a Station Admin</w:t>
+        <w:t>2.3 How to Add a Station Admin</w:t>
       </w:r>
     </w:p>
     <w:p>
@@ -733,35 +620,26 @@
         </w:numPr>
       </w:pPr>
       <w:r>
-        <w:t xml:space="preserve">The</w:t>
-      </w:r>
-      <w:r>
-        <w:t xml:space="preserve"> </w:t>
-      </w:r>
-      <w:r>
-        <w:rPr>
-          <w:b/>
-          <w:bCs/>
-        </w:rPr>
-        <w:t xml:space="preserve">Provincial Admin</w:t>
-      </w:r>
-      <w:r>
-        <w:t xml:space="preserve"> </w:t>
-      </w:r>
-      <w:r>
-        <w:t xml:space="preserve">navigates to</w:t>
-      </w:r>
-      <w:r>
-        <w:t xml:space="preserve"> </w:t>
+        <w:t xml:space="preserve">The </w:t>
+      </w:r>
+      <w:r>
+        <w:rPr>
+          <w:b/>
+          <w:bCs/>
+        </w:rPr>
+        <w:t>Provincial Admin</w:t>
+      </w:r>
+      <w:r>
+        <w:t xml:space="preserve"> navigates to </w:t>
       </w:r>
       <w:r>
         <w:rPr>
           <w:rStyle w:val="VerbatimChar"/>
         </w:rPr>
-        <w:t xml:space="preserve">User Management &gt; Add User</w:t>
-      </w:r>
-      <w:r>
-        <w:t xml:space="preserve">.</w:t>
+        <w:t>User Management &gt; Add User</w:t>
+      </w:r>
+      <w:r>
+        <w:t>.</w:t>
       </w:r>
     </w:p>
     <w:p>
@@ -773,7 +651,7 @@
         </w:numPr>
       </w:pPr>
       <w:r>
-        <w:t xml:space="preserve">Enters the Admin’s details (Name, Service Number, Email).</w:t>
+        <w:t>Enters the Admin’s details (Name, Service Number, Email).</w:t>
       </w:r>
     </w:p>
     <w:p>
@@ -785,22 +663,16 @@
         </w:numPr>
       </w:pPr>
       <w:r>
-        <w:t xml:space="preserve">Selects the</w:t>
-      </w:r>
-      <w:r>
-        <w:t xml:space="preserve"> </w:t>
+        <w:t xml:space="preserve">Selects the </w:t>
       </w:r>
       <w:r>
         <w:rPr>
           <w:rStyle w:val="VerbatimChar"/>
         </w:rPr>
-        <w:t xml:space="preserve">OrgUnit</w:t>
-      </w:r>
-      <w:r>
-        <w:t xml:space="preserve"> </w:t>
-      </w:r>
-      <w:r>
-        <w:t xml:space="preserve">(the newly created Station).</w:t>
+        <w:t>OrgUnit</w:t>
+      </w:r>
+      <w:r>
+        <w:t xml:space="preserve"> (the newly created Station).</w:t>
       </w:r>
     </w:p>
     <w:p>
@@ -812,22 +684,16 @@
         </w:numPr>
       </w:pPr>
       <w:r>
-        <w:t xml:space="preserve">Selects the</w:t>
-      </w:r>
-      <w:r>
-        <w:t xml:space="preserve"> </w:t>
+        <w:t xml:space="preserve">Selects the </w:t>
       </w:r>
       <w:r>
         <w:rPr>
           <w:rStyle w:val="VerbatimChar"/>
         </w:rPr>
-        <w:t xml:space="preserve">Department</w:t>
-      </w:r>
-      <w:r>
-        <w:t xml:space="preserve"> </w:t>
-      </w:r>
-      <w:r>
-        <w:t xml:space="preserve">(Administration).</w:t>
+        <w:t>Department</w:t>
+      </w:r>
+      <w:r>
+        <w:t xml:space="preserve"> (Administration).</w:t>
       </w:r>
     </w:p>
     <w:p>
@@ -839,31 +705,25 @@
         </w:numPr>
       </w:pPr>
       <w:r>
-        <w:t xml:space="preserve">Selects the</w:t>
-      </w:r>
-      <w:r>
-        <w:t xml:space="preserve"> </w:t>
+        <w:t xml:space="preserve">Selects the </w:t>
       </w:r>
       <w:r>
         <w:rPr>
           <w:rStyle w:val="VerbatimChar"/>
         </w:rPr>
-        <w:t xml:space="preserve">Role</w:t>
-      </w:r>
-      <w:r>
-        <w:t xml:space="preserve"> </w:t>
-      </w:r>
-      <w:r>
-        <w:t xml:space="preserve">(</w:t>
+        <w:t>Role</w:t>
+      </w:r>
+      <w:r>
+        <w:t xml:space="preserve"> (</w:t>
       </w:r>
       <w:r>
         <w:rPr>
           <w:rStyle w:val="VerbatimChar"/>
         </w:rPr>
-        <w:t xml:space="preserve">ADMIN_OFFICER</w:t>
-      </w:r>
-      <w:r>
-        <w:t xml:space="preserve">).</w:t>
+        <w:t>ADMIN_OFFICER</w:t>
+      </w:r>
+      <w:r>
+        <w:t>).</w:t>
       </w:r>
     </w:p>
     <w:p>
@@ -875,23 +735,17 @@
         </w:numPr>
       </w:pPr>
       <w:r>
-        <w:t xml:space="preserve">The system automatically generates a temporary password and sends it to the user’s email.</w:t>
-      </w:r>
-      <w:r>
-        <w:t xml:space="preserve"> </w:t>
-      </w:r>
-      <w:r>
-        <w:rPr>
-          <w:b/>
-          <w:bCs/>
-        </w:rPr>
-        <w:t xml:space="preserve">Station Admin Responsibilities:</w:t>
-      </w:r>
-      <w:r>
-        <w:t xml:space="preserve"> </w:t>
-      </w:r>
-      <w:r>
-        <w:t xml:space="preserve">Overseeing all station operations, onboarding station officers, managing daily operational audits, and requesting data exposures (e.g., escalating an incident to the province).</w:t>
+        <w:t xml:space="preserve">The system automatically generates a temporary password and sends it to the user’s email. </w:t>
+      </w:r>
+      <w:r>
+        <w:rPr>
+          <w:b/>
+          <w:bCs/>
+        </w:rPr>
+        <w:t>Station Admin Responsibilities:</w:t>
+      </w:r>
+      <w:r>
+        <w:t xml:space="preserve"> Overseeing all station operations, onboarding station officers, managing daily operational audits, and requesting data exposures (e.g., escalating an incident to the province).</w:t>
       </w:r>
     </w:p>
     <w:bookmarkEnd w:id="14"/>
@@ -901,149 +755,86 @@
         <w:pStyle w:val="Heading3"/>
       </w:pPr>
       <w:r>
-        <w:t xml:space="preserve">2.4 How to Add an Officer (System User)</w:t>
-      </w:r>
-    </w:p>
-    <w:p>
-      <w:pPr>
-        <w:pStyle w:val="FirstParagraph"/>
-      </w:pPr>
-      <w:r>
-        <w:t xml:space="preserve">Adding an officer follows the same flow as adding an Admin, but is typically performed by the</w:t>
-      </w:r>
-      <w:r>
-        <w:t xml:space="preserve"> </w:t>
-      </w:r>
-      <w:r>
-        <w:rPr>
-          <w:b/>
-          <w:bCs/>
-        </w:rPr>
-        <w:t xml:space="preserve">Station Admin</w:t>
-      </w:r>
-      <w:r>
-        <w:t xml:space="preserve"> </w:t>
-      </w:r>
-      <w:r>
-        <w:t xml:space="preserve">or an</w:t>
-      </w:r>
-      <w:r>
-        <w:t xml:space="preserve"> </w:t>
-      </w:r>
-      <w:r>
-        <w:rPr>
-          <w:b/>
-          <w:bCs/>
-        </w:rPr>
-        <w:t xml:space="preserve">HR Officer</w:t>
-      </w:r>
-      <w:r>
-        <w:t xml:space="preserve">.</w:t>
-      </w:r>
-      <w:r>
-        <w:t xml:space="preserve"> </w:t>
-      </w:r>
-      <w:r>
-        <w:t xml:space="preserve">1. Navigate to</w:t>
-      </w:r>
-      <w:r>
-        <w:t xml:space="preserve"> </w:t>
+        <w:t>2.4 How to Add an Officer (System User)</w:t>
+      </w:r>
+    </w:p>
+    <w:p>
+      <w:pPr>
+        <w:pStyle w:val="FirstParagraph"/>
+      </w:pPr>
+      <w:r>
+        <w:t xml:space="preserve">Adding an officer follows the same flow as adding an Admin, but is typically performed by the </w:t>
+      </w:r>
+      <w:r>
+        <w:rPr>
+          <w:b/>
+          <w:bCs/>
+        </w:rPr>
+        <w:t>Station Admin</w:t>
+      </w:r>
+      <w:r>
+        <w:t xml:space="preserve"> or an </w:t>
+      </w:r>
+      <w:r>
+        <w:rPr>
+          <w:b/>
+          <w:bCs/>
+        </w:rPr>
+        <w:t>HR Officer</w:t>
+      </w:r>
+      <w:r>
+        <w:t xml:space="preserve">. 1. Navigate to </w:t>
       </w:r>
       <w:r>
         <w:rPr>
           <w:rStyle w:val="VerbatimChar"/>
         </w:rPr>
-        <w:t xml:space="preserve">User Management &gt; Register Officer</w:t>
-      </w:r>
-      <w:r>
-        <w:t xml:space="preserve">.</w:t>
-      </w:r>
-      <w:r>
-        <w:t xml:space="preserve"> </w:t>
-      </w:r>
-      <w:r>
-        <w:t xml:space="preserve">2. Enter the Officer’s demographic and employment details.</w:t>
-      </w:r>
-      <w:r>
-        <w:t xml:space="preserve"> </w:t>
-      </w:r>
-      <w:r>
-        <w:t xml:space="preserve">3. Assign them to a specific</w:t>
-      </w:r>
-      <w:r>
-        <w:t xml:space="preserve"> </w:t>
+        <w:t>User Management &gt; Register Officer</w:t>
+      </w:r>
+      <w:r>
+        <w:t xml:space="preserve">. 2. Enter the Officer’s demographic and employment details. 3. Assign them to a specific </w:t>
       </w:r>
       <w:r>
         <w:rPr>
           <w:rStyle w:val="VerbatimChar"/>
         </w:rPr>
-        <w:t xml:space="preserve">Department</w:t>
-      </w:r>
-      <w:r>
-        <w:t xml:space="preserve"> </w:t>
-      </w:r>
-      <w:r>
-        <w:t xml:space="preserve">(e.g., Health).</w:t>
-      </w:r>
-      <w:r>
-        <w:t xml:space="preserve"> </w:t>
-      </w:r>
-      <w:r>
-        <w:t xml:space="preserve">4. Assign them a specific</w:t>
-      </w:r>
-      <w:r>
-        <w:t xml:space="preserve"> </w:t>
+        <w:t>Department</w:t>
+      </w:r>
+      <w:r>
+        <w:t xml:space="preserve"> (e.g., Health). 4. Assign them a specific </w:t>
       </w:r>
       <w:r>
         <w:rPr>
           <w:rStyle w:val="VerbatimChar"/>
         </w:rPr>
-        <w:t xml:space="preserve">Role</w:t>
-      </w:r>
-      <w:r>
-        <w:t xml:space="preserve"> </w:t>
-      </w:r>
-      <w:r>
-        <w:t xml:space="preserve">(e.g.,</w:t>
-      </w:r>
-      <w:r>
-        <w:t xml:space="preserve"> </w:t>
+        <w:t>Role</w:t>
+      </w:r>
+      <w:r>
+        <w:t xml:space="preserve"> (e.g., </w:t>
       </w:r>
       <w:r>
         <w:rPr>
           <w:rStyle w:val="VerbatimChar"/>
         </w:rPr>
-        <w:t xml:space="preserve">HEALTH_OFFICER</w:t>
-      </w:r>
-      <w:r>
-        <w:t xml:space="preserve">).</w:t>
-      </w:r>
-      <w:r>
-        <w:t xml:space="preserve"> </w:t>
-      </w:r>
-      <w:r>
-        <w:t xml:space="preserve">5. Complete registration. The officer can now log in and access modules relevant</w:t>
-      </w:r>
-      <w:r>
-        <w:t xml:space="preserve"> </w:t>
+        <w:t>HEALTH_OFFICER</w:t>
+      </w:r>
+      <w:r>
+        <w:t xml:space="preserve">). 5. Complete registration. The officer can now log in and access modules relevant </w:t>
       </w:r>
       <w:r>
         <w:rPr>
           <w:i/>
           <w:iCs/>
         </w:rPr>
-        <w:t xml:space="preserve">only</w:t>
-      </w:r>
-      <w:r>
-        <w:t xml:space="preserve"> </w:t>
-      </w:r>
-      <w:r>
-        <w:t xml:space="preserve">to their department and station.</w:t>
-      </w:r>
-    </w:p>
-    <w:p>
-      <w:r>
-        <w:pict>
+        <w:t>only</w:t>
+      </w:r>
+      <w:r>
+        <w:t xml:space="preserve"> to their department and station.</w:t>
+      </w:r>
+    </w:p>
+    <w:p>
+      <w:r>
+        <w:pict xmlns:w="http://schemas.openxmlformats.org/wordprocessingml/2006/main" xmlns:v="urn:schemas-microsoft-com:vml" xmlns:o="urn:schemas-microsoft-com:office:office">
           <v:rect style="width:0;height:1.5pt" o:hralign="center" o:hrstd="t" o:hr="t"/>
         </w:pict>
       </w:r>
@@ -1056,15 +847,15 @@
         <w:pStyle w:val="Heading2"/>
       </w:pPr>
       <w:r>
-        <w:t xml:space="preserve">3. Operational Roles and Responsibilities</w:t>
-      </w:r>
-    </w:p>
-    <w:p>
-      <w:pPr>
-        <w:pStyle w:val="FirstParagraph"/>
-      </w:pPr>
-      <w:r>
-        <w:t xml:space="preserve">The system enforces strict Role-Based Access Control (RBAC). A user’s experience is dictated by their role:</w:t>
+        <w:t>3. Operational Roles and Responsibilities</w:t>
+      </w:r>
+    </w:p>
+    <w:p>
+      <w:pPr>
+        <w:pStyle w:val="FirstParagraph"/>
+      </w:pPr>
+      <w:r>
+        <w:t>The system enforces strict Role-Based Access Control (RBAC). A user’s experience is dictated by their role:</w:t>
       </w:r>
     </w:p>
     <w:p>
@@ -1080,13 +871,10 @@
           <w:b/>
           <w:bCs/>
         </w:rPr>
-        <w:t xml:space="preserve">Reception Officer:</w:t>
-      </w:r>
-      <w:r>
-        <w:t xml:space="preserve"> </w:t>
-      </w:r>
-      <w:r>
-        <w:t xml:space="preserve">Station-based. Responsible for inmate admissions, capturing biometrics, recording valuables, and maintaining legal case/offence data.</w:t>
+        <w:t>Reception Officer:</w:t>
+      </w:r>
+      <w:r>
+        <w:t xml:space="preserve"> Station-based. Responsible for inmate admissions, capturing biometrics, recording valuables, and maintaining legal case/offence data.</w:t>
       </w:r>
     </w:p>
     <w:p>
@@ -1102,13 +890,10 @@
           <w:b/>
           <w:bCs/>
         </w:rPr>
-        <w:t xml:space="preserve">Health Officer:</w:t>
-      </w:r>
-      <w:r>
-        <w:t xml:space="preserve"> </w:t>
-      </w:r>
-      <w:r>
-        <w:t xml:space="preserve">Station-based. Responsible for the medical wellbeing of inmates. Conducts admission health assessments, logs daily clinical visits, and manages medicinal inventory.</w:t>
+        <w:t>Health Officer:</w:t>
+      </w:r>
+      <w:r>
+        <w:t xml:space="preserve"> Station-based. Responsible for the medical wellbeing of inmates. Conducts admission health assessments, logs daily clinical visits, and manages medicinal inventory.</w:t>
       </w:r>
     </w:p>
     <w:p>
@@ -1124,13 +909,10 @@
           <w:b/>
           <w:bCs/>
         </w:rPr>
-        <w:t xml:space="preserve">HR Officer:</w:t>
-      </w:r>
-      <w:r>
-        <w:t xml:space="preserve"> </w:t>
-      </w:r>
-      <w:r>
-        <w:t xml:space="preserve">Provincial or Station-based. Manages staff profiles, tracks officer postings/transfers between stations, and manages disciplinary records for staff.</w:t>
+        <w:t>HR Officer:</w:t>
+      </w:r>
+      <w:r>
+        <w:t xml:space="preserve"> Provincial or Station-based. Manages staff profiles, tracks officer postings/transfers between stations, and manages disciplinary records for staff.</w:t>
       </w:r>
     </w:p>
     <w:p>
@@ -1146,13 +928,10 @@
           <w:b/>
           <w:bCs/>
         </w:rPr>
-        <w:t xml:space="preserve">Stores Officer:</w:t>
-      </w:r>
-      <w:r>
-        <w:t xml:space="preserve"> </w:t>
-      </w:r>
-      <w:r>
-        <w:t xml:space="preserve">Station-based. Manages physical inventory, handles stock receipts, allocates equipment to officers, and logs inmate feeding sessions.</w:t>
+        <w:t>Stores Officer:</w:t>
+      </w:r>
+      <w:r>
+        <w:t xml:space="preserve"> Station-based. Manages physical inventory, handles stock receipts, allocates equipment to officers, and logs inmate feeding sessions.</w:t>
       </w:r>
     </w:p>
     <w:p>
@@ -1168,18 +947,15 @@
           <w:b/>
           <w:bCs/>
         </w:rPr>
-        <w:t xml:space="preserve">Farms Officer:</w:t>
-      </w:r>
-      <w:r>
-        <w:t xml:space="preserve"> </w:t>
-      </w:r>
-      <w:r>
-        <w:t xml:space="preserve">Station-based. Manages agricultural production, logs crop yields, and tracks livestock on prison farms.</w:t>
-      </w:r>
-    </w:p>
-    <w:p>
-      <w:r>
-        <w:pict>
+        <w:t>Farms Officer:</w:t>
+      </w:r>
+      <w:r>
+        <w:t xml:space="preserve"> Station-based. Manages agricultural production, logs crop yields, and tracks livestock on prison farms.</w:t>
+      </w:r>
+    </w:p>
+    <w:p>
+      <w:r>
+        <w:pict xmlns:w="http://schemas.openxmlformats.org/wordprocessingml/2006/main" xmlns:v="urn:schemas-microsoft-com:vml" xmlns:o="urn:schemas-microsoft-com:office:office">
           <v:rect style="width:0;height:1.5pt" o:hralign="center" o:hrstd="t" o:hr="t"/>
         </w:pict>
       </w:r>
@@ -1191,7 +967,7 @@
         <w:pStyle w:val="Heading2"/>
       </w:pPr>
       <w:r>
-        <w:t xml:space="preserve">4. Inmate Management Workflows</w:t>
+        <w:t>4. Inmate Management Workflows</w:t>
       </w:r>
     </w:p>
     <w:bookmarkStart w:id="18" w:name="how-to-add-an-inmate-basic-registration"/>
@@ -1200,19 +976,19 @@
         <w:pStyle w:val="Heading3"/>
       </w:pPr>
       <w:r>
-        <w:t xml:space="preserve">4.1 How to Add an Inmate (Basic Registration)</w:t>
-      </w:r>
-    </w:p>
-    <w:p>
-      <w:pPr>
-        <w:pStyle w:val="FirstParagraph"/>
-      </w:pPr>
-      <w:r>
-        <w:rPr>
-          <w:b/>
-          <w:bCs/>
-        </w:rPr>
-        <w:t xml:space="preserve">Responsible Account:</w:t>
+        <w:t>4.1 How to Add an Inmate (Basic Registration)</w:t>
+      </w:r>
+    </w:p>
+    <w:p>
+      <w:pPr>
+        <w:pStyle w:val="FirstParagraph"/>
+      </w:pPr>
+      <w:r>
+        <w:rPr>
+          <w:b/>
+          <w:bCs/>
+        </w:rPr>
+        <w:t>Responsible Account:</w:t>
       </w:r>
       <w:r>
         <w:t xml:space="preserve"> </w:t>
@@ -1221,135 +997,109 @@
         <w:rPr>
           <w:rStyle w:val="VerbatimChar"/>
         </w:rPr>
-        <w:t xml:space="preserve">RECEPTION_OFFICER</w:t>
+        <w:t>RECEPTION_OFFICER</w:t>
       </w:r>
       <w:r>
         <w:t xml:space="preserve"> </w:t>
       </w:r>
-      <w:r>
-        <w:t xml:space="preserve">1. Navigate to</w:t>
-      </w:r>
-      <w:r>
-        <w:t xml:space="preserve"> </w:t>
+    </w:p>
+    <w:p>
+      <w:pPr>
+        <w:pStyle w:val="FirstParagraph"/>
+      </w:pPr>
+      <w:r>
+        <w:t xml:space="preserve">1. Navigate to </w:t>
       </w:r>
       <w:r>
         <w:rPr>
           <w:rStyle w:val="VerbatimChar"/>
         </w:rPr>
-        <w:t xml:space="preserve">Reception &gt; Inmate Registration</w:t>
-      </w:r>
-      <w:r>
-        <w:t xml:space="preserve">.</w:t>
-      </w:r>
-      <w:r>
-        <w:t xml:space="preserve"> </w:t>
-      </w:r>
-      <w:r>
-        <w:t xml:space="preserve">2.</w:t>
-      </w:r>
-      <w:r>
-        <w:t xml:space="preserve"> </w:t>
-      </w:r>
-      <w:r>
-        <w:rPr>
-          <w:b/>
-          <w:bCs/>
-        </w:rPr>
-        <w:t xml:space="preserve">Basic Details:</w:t>
-      </w:r>
-      <w:r>
-        <w:t xml:space="preserve"> </w:t>
-      </w:r>
-      <w:r>
-        <w:t xml:space="preserve">Enter Prison Number, Full Name, DOB, Gender, and capture Biometrics.</w:t>
-      </w:r>
-      <w:r>
-        <w:t xml:space="preserve"> </w:t>
-      </w:r>
-      <w:r>
-        <w:t xml:space="preserve">3.</w:t>
-      </w:r>
-      <w:r>
-        <w:t xml:space="preserve"> </w:t>
-      </w:r>
-      <w:r>
-        <w:rPr>
-          <w:b/>
-          <w:bCs/>
-        </w:rPr>
-        <w:t xml:space="preserve">Next of Kin:</w:t>
-      </w:r>
-      <w:r>
-        <w:t xml:space="preserve"> </w:t>
-      </w:r>
-      <w:r>
-        <w:t xml:space="preserve">Enter the emergency contact details, relationship, and physical address.</w:t>
-      </w:r>
-      <w:r>
-        <w:t xml:space="preserve"> </w:t>
-      </w:r>
-      <w:r>
-        <w:t xml:space="preserve">4.</w:t>
-      </w:r>
-      <w:r>
-        <w:t xml:space="preserve"> </w:t>
-      </w:r>
-      <w:r>
-        <w:rPr>
-          <w:b/>
-          <w:bCs/>
-        </w:rPr>
-        <w:t xml:space="preserve">Classification:</w:t>
-      </w:r>
-      <w:r>
-        <w:t xml:space="preserve"> </w:t>
-      </w:r>
-      <w:r>
-        <w:t xml:space="preserve">Assign an initial security classification based on preliminary data.</w:t>
-      </w:r>
-      <w:r>
-        <w:t xml:space="preserve"> </w:t>
-      </w:r>
-      <w:r>
-        <w:t xml:space="preserve">5.</w:t>
-      </w:r>
-      <w:r>
-        <w:t xml:space="preserve"> </w:t>
-      </w:r>
-      <w:r>
-        <w:rPr>
-          <w:b/>
-          <w:bCs/>
-        </w:rPr>
-        <w:t xml:space="preserve">Valuables:</w:t>
-      </w:r>
-      <w:r>
-        <w:t xml:space="preserve"> </w:t>
-      </w:r>
-      <w:r>
-        <w:t xml:space="preserve">Log any personal belongings (cash, jewelry, phones) surrendered at admission.</w:t>
-      </w:r>
-      <w:r>
-        <w:t xml:space="preserve"> </w:t>
-      </w:r>
-      <w:r>
-        <w:t xml:space="preserve">6.</w:t>
-      </w:r>
-      <w:r>
-        <w:t xml:space="preserve"> </w:t>
-      </w:r>
-      <w:r>
-        <w:rPr>
-          <w:b/>
-          <w:bCs/>
-        </w:rPr>
-        <w:t xml:space="preserve">Submit:</w:t>
-      </w:r>
-      <w:r>
-        <w:t xml:space="preserve"> </w:t>
-      </w:r>
-      <w:r>
-        <w:t xml:space="preserve">Generates the core Inmate Profile and an unapproved admission record.</w:t>
+        <w:t>Reception &gt; Inmate Registration</w:t>
+      </w:r>
+      <w:r>
+        <w:t xml:space="preserve">. </w:t>
+      </w:r>
+    </w:p>
+    <w:p>
+      <w:pPr>
+        <w:pStyle w:val="FirstParagraph"/>
+      </w:pPr>
+      <w:r>
+        <w:t xml:space="preserve">2. </w:t>
+      </w:r>
+      <w:r>
+        <w:rPr>
+          <w:b/>
+          <w:bCs/>
+        </w:rPr>
+        <w:t>Basic Details:</w:t>
+      </w:r>
+      <w:r>
+        <w:t xml:space="preserve"> Enter Prison Number, Full Name, DOB, Gender, and capture Biometrics. 3. </w:t>
+      </w:r>
+      <w:r>
+        <w:rPr>
+          <w:b/>
+          <w:bCs/>
+        </w:rPr>
+        <w:t>Next of Kin:</w:t>
+      </w:r>
+      <w:r>
+        <w:t xml:space="preserve"> Enter the emergency contact details, relationship, and physical address. </w:t>
+      </w:r>
+    </w:p>
+    <w:p>
+      <w:pPr>
+        <w:pStyle w:val="FirstParagraph"/>
+      </w:pPr>
+      <w:r>
+        <w:t xml:space="preserve">4. </w:t>
+      </w:r>
+      <w:r>
+        <w:rPr>
+          <w:b/>
+          <w:bCs/>
+        </w:rPr>
+        <w:t>Classification:</w:t>
+      </w:r>
+      <w:r>
+        <w:t xml:space="preserve"> Assign an initial security classification based on preliminary data. </w:t>
+      </w:r>
+    </w:p>
+    <w:p>
+      <w:pPr>
+        <w:pStyle w:val="FirstParagraph"/>
+      </w:pPr>
+      <w:r>
+        <w:t xml:space="preserve">5. </w:t>
+      </w:r>
+      <w:r>
+        <w:rPr>
+          <w:b/>
+          <w:bCs/>
+        </w:rPr>
+        <w:t>Valuables:</w:t>
+      </w:r>
+      <w:r>
+        <w:t xml:space="preserve"> Log any personal belongings (cash, jewelry, phones) surrendered at admission. </w:t>
+      </w:r>
+    </w:p>
+    <w:p>
+      <w:pPr>
+        <w:pStyle w:val="FirstParagraph"/>
+      </w:pPr>
+      <w:r>
+        <w:t xml:space="preserve">6. </w:t>
+      </w:r>
+      <w:r>
+        <w:rPr>
+          <w:b/>
+          <w:bCs/>
+        </w:rPr>
+        <w:t>Submit:</w:t>
+      </w:r>
+      <w:r>
+        <w:t xml:space="preserve"> Generates the core Inmate Profile and an unapproved admission record.</w:t>
       </w:r>
     </w:p>
     <w:bookmarkEnd w:id="18"/>
@@ -1359,84 +1109,45 @@
         <w:pStyle w:val="Heading3"/>
       </w:pPr>
       <w:r>
-        <w:t xml:space="preserve">4.2 How to Add an Offence (Scenarios)</w:t>
-      </w:r>
-    </w:p>
-    <w:p>
-      <w:pPr>
-        <w:pStyle w:val="FirstParagraph"/>
-      </w:pPr>
-      <w:r>
-        <w:t xml:space="preserve">Immediately following basic registration, the Reception Officer must attach legal charges.</w:t>
-      </w:r>
-      <w:r>
-        <w:t xml:space="preserve"> </w:t>
-      </w:r>
-      <w:r>
-        <w:rPr>
-          <w:b/>
-          <w:bCs/>
-        </w:rPr>
-        <w:t xml:space="preserve">Scenario A: Remand / Unconvicted</w:t>
-      </w:r>
-      <w:r>
-        <w:t xml:space="preserve"> </w:t>
-      </w:r>
-      <w:r>
-        <w:t xml:space="preserve">1. Select the Inmate and click</w:t>
-      </w:r>
-      <w:r>
-        <w:t xml:space="preserve"> </w:t>
-      </w:r>
-      <w:r>
-        <w:rPr>
-          <w:b/>
-          <w:bCs/>
-        </w:rPr>
-        <w:t xml:space="preserve">Add Offence</w:t>
-      </w:r>
-      <w:r>
-        <w:t xml:space="preserve">.</w:t>
-      </w:r>
-      <w:r>
-        <w:t xml:space="preserve"> </w:t>
-      </w:r>
-      <w:r>
-        <w:t xml:space="preserve">2. Enter the Offence description, Court location, and arresting authority.</w:t>
-      </w:r>
-      <w:r>
-        <w:t xml:space="preserve"> </w:t>
-      </w:r>
-      <w:r>
-        <w:t xml:space="preserve">3. Since the inmate is unconvicted, the system prompts for a</w:t>
-      </w:r>
-      <w:r>
-        <w:t xml:space="preserve"> </w:t>
-      </w:r>
-      <w:r>
-        <w:rPr>
-          <w:b/>
-          <w:bCs/>
-        </w:rPr>
-        <w:t xml:space="preserve">Next Court Date</w:t>
-      </w:r>
-      <w:r>
-        <w:t xml:space="preserve">.</w:t>
-      </w:r>
-      <w:r>
-        <w:t xml:space="preserve"> </w:t>
-      </w:r>
-      <w:r>
-        <w:t xml:space="preserve">4. Save the offence. The inmate is classified as</w:t>
-      </w:r>
-      <w:r>
-        <w:t xml:space="preserve"> </w:t>
-      </w:r>
-      <w:r>
-        <w:t xml:space="preserve">‘Remand’</w:t>
-      </w:r>
-      <w:r>
-        <w:t xml:space="preserve">.</w:t>
+        <w:t>4.2 How to Add an Offence (Scenarios)</w:t>
+      </w:r>
+    </w:p>
+    <w:p>
+      <w:pPr>
+        <w:pStyle w:val="FirstParagraph"/>
+      </w:pPr>
+      <w:r>
+        <w:t xml:space="preserve">Immediately following basic registration, the Reception Officer must attach legal charges. </w:t>
+      </w:r>
+      <w:r>
+        <w:rPr>
+          <w:b/>
+          <w:bCs/>
+        </w:rPr>
+        <w:t>Scenario A: Remand / Unconvicted</w:t>
+      </w:r>
+      <w:r>
+        <w:t xml:space="preserve"> 1. Select the Inmate and click </w:t>
+      </w:r>
+      <w:r>
+        <w:rPr>
+          <w:b/>
+          <w:bCs/>
+        </w:rPr>
+        <w:t>Add Offence</w:t>
+      </w:r>
+      <w:r>
+        <w:t xml:space="preserve">. 2. Enter the Offence description, Court location, and arresting authority. 3. Since the inmate is unconvicted, the system prompts for a </w:t>
+      </w:r>
+      <w:r>
+        <w:rPr>
+          <w:b/>
+          <w:bCs/>
+        </w:rPr>
+        <w:t>Next Court Date</w:t>
+      </w:r>
+      <w:r>
+        <w:t>. 4. Save the offence. The inmate is classified as ‘Remand’.</w:t>
       </w:r>
     </w:p>
     <w:p>
@@ -1448,134 +1159,80 @@
           <w:b/>
           <w:bCs/>
         </w:rPr>
-        <w:t xml:space="preserve">Scenario B: Convicted</w:t>
-      </w:r>
-      <w:r>
-        <w:t xml:space="preserve"> </w:t>
-      </w:r>
-      <w:r>
-        <w:t xml:space="preserve">1. Select the Inmate and click</w:t>
-      </w:r>
-      <w:r>
-        <w:t xml:space="preserve"> </w:t>
-      </w:r>
-      <w:r>
-        <w:rPr>
-          <w:b/>
-          <w:bCs/>
-        </w:rPr>
-        <w:t xml:space="preserve">Add Offence</w:t>
-      </w:r>
-      <w:r>
-        <w:t xml:space="preserve">.</w:t>
-      </w:r>
-      <w:r>
-        <w:t xml:space="preserve"> </w:t>
-      </w:r>
-      <w:r>
-        <w:t xml:space="preserve">2. Enter the Offence and Court details.</w:t>
-      </w:r>
-      <w:r>
-        <w:t xml:space="preserve"> </w:t>
-      </w:r>
-      <w:r>
-        <w:t xml:space="preserve">3. Mark as</w:t>
-      </w:r>
-      <w:r>
-        <w:t xml:space="preserve"> </w:t>
-      </w:r>
-      <w:r>
-        <w:rPr>
-          <w:b/>
-          <w:bCs/>
-        </w:rPr>
-        <w:t xml:space="preserve">Convicted</w:t>
-      </w:r>
-      <w:r>
-        <w:t xml:space="preserve">.</w:t>
-      </w:r>
-      <w:r>
-        <w:t xml:space="preserve"> </w:t>
-      </w:r>
-      <w:r>
-        <w:t xml:space="preserve">4. The system dynamically alters the form to request:</w:t>
-      </w:r>
-      <w:r>
-        <w:t xml:space="preserve"> </w:t>
-      </w:r>
-      <w:r>
-        <w:rPr>
-          <w:b/>
-          <w:bCs/>
-        </w:rPr>
-        <w:t xml:space="preserve">Sentence Length</w:t>
-      </w:r>
-      <w:r>
-        <w:t xml:space="preserve">,</w:t>
-      </w:r>
-      <w:r>
-        <w:t xml:space="preserve"> </w:t>
-      </w:r>
-      <w:r>
-        <w:rPr>
-          <w:b/>
-          <w:bCs/>
-        </w:rPr>
-        <w:t xml:space="preserve">Sentence Start Date</w:t>
-      </w:r>
-      <w:r>
-        <w:t xml:space="preserve">,</w:t>
-      </w:r>
-      <w:r>
-        <w:t xml:space="preserve"> </w:t>
-      </w:r>
-      <w:r>
-        <w:rPr>
-          <w:b/>
-          <w:bCs/>
-        </w:rPr>
-        <w:t xml:space="preserve">Expected Remission</w:t>
-      </w:r>
-      <w:r>
-        <w:t xml:space="preserve">, and</w:t>
-      </w:r>
-      <w:r>
-        <w:t xml:space="preserve"> </w:t>
-      </w:r>
-      <w:r>
-        <w:rPr>
-          <w:b/>
-          <w:bCs/>
-        </w:rPr>
-        <w:t xml:space="preserve">Restitution Details</w:t>
-      </w:r>
-      <w:r>
-        <w:t xml:space="preserve"> </w:t>
-      </w:r>
-      <w:r>
-        <w:t xml:space="preserve">(if applicable).</w:t>
-      </w:r>
-      <w:r>
-        <w:t xml:space="preserve"> </w:t>
-      </w:r>
-      <w:r>
-        <w:t xml:space="preserve">5. If multiple offences exist, repeat the loop. The system will automatically calculate the aggregate</w:t>
-      </w:r>
-      <w:r>
-        <w:t xml:space="preserve"> </w:t>
-      </w:r>
-      <w:r>
-        <w:rPr>
-          <w:b/>
-          <w:bCs/>
-        </w:rPr>
-        <w:t xml:space="preserve">Expected Release Date</w:t>
-      </w:r>
-      <w:r>
-        <w:t xml:space="preserve"> </w:t>
-      </w:r>
-      <w:r>
-        <w:t xml:space="preserve">based on concurrent or consecutive sentence flags.</w:t>
+        <w:t>Scenario B: Convicted</w:t>
+      </w:r>
+      <w:r>
+        <w:t xml:space="preserve"> 1. Select the Inmate and click </w:t>
+      </w:r>
+      <w:r>
+        <w:rPr>
+          <w:b/>
+          <w:bCs/>
+        </w:rPr>
+        <w:t>Add Offence</w:t>
+      </w:r>
+      <w:r>
+        <w:t xml:space="preserve">. 2. Enter the Offence and Court details. 3. Mark as </w:t>
+      </w:r>
+      <w:r>
+        <w:rPr>
+          <w:b/>
+          <w:bCs/>
+        </w:rPr>
+        <w:t>Convicted</w:t>
+      </w:r>
+      <w:r>
+        <w:t xml:space="preserve">. 4. The system dynamically alters the form to request: </w:t>
+      </w:r>
+      <w:r>
+        <w:rPr>
+          <w:b/>
+          <w:bCs/>
+        </w:rPr>
+        <w:t>Sentence Length</w:t>
+      </w:r>
+      <w:r>
+        <w:t xml:space="preserve">, </w:t>
+      </w:r>
+      <w:r>
+        <w:rPr>
+          <w:b/>
+          <w:bCs/>
+        </w:rPr>
+        <w:t>Sentence Start Date</w:t>
+      </w:r>
+      <w:r>
+        <w:t xml:space="preserve">, </w:t>
+      </w:r>
+      <w:r>
+        <w:rPr>
+          <w:b/>
+          <w:bCs/>
+        </w:rPr>
+        <w:t>Expected Remission</w:t>
+      </w:r>
+      <w:r>
+        <w:t xml:space="preserve">, and </w:t>
+      </w:r>
+      <w:r>
+        <w:rPr>
+          <w:b/>
+          <w:bCs/>
+        </w:rPr>
+        <w:t>Restitution Details</w:t>
+      </w:r>
+      <w:r>
+        <w:t xml:space="preserve"> (if applicable). 5. If multiple offences exist, repeat the loop. The system will automatically calculate the aggregate </w:t>
+      </w:r>
+      <w:r>
+        <w:rPr>
+          <w:b/>
+          <w:bCs/>
+        </w:rPr>
+        <w:t>Expected Release Date</w:t>
+      </w:r>
+      <w:r>
+        <w:t xml:space="preserve"> based on concurrent or consecutive sentence flags.</w:t>
       </w:r>
     </w:p>
     <w:bookmarkEnd w:id="19"/>
@@ -1585,19 +1242,19 @@
         <w:pStyle w:val="Heading3"/>
       </w:pPr>
       <w:r>
-        <w:t xml:space="preserve">4.3 How to Perform a Health Assessment</w:t>
-      </w:r>
-    </w:p>
-    <w:p>
-      <w:pPr>
-        <w:pStyle w:val="FirstParagraph"/>
-      </w:pPr>
-      <w:r>
-        <w:rPr>
-          <w:b/>
-          <w:bCs/>
-        </w:rPr>
-        <w:t xml:space="preserve">Responsible Account:</w:t>
+        <w:t>4.3 How to Perform a Health Assessment</w:t>
+      </w:r>
+    </w:p>
+    <w:p>
+      <w:pPr>
+        <w:pStyle w:val="FirstParagraph"/>
+      </w:pPr>
+      <w:r>
+        <w:rPr>
+          <w:b/>
+          <w:bCs/>
+        </w:rPr>
+        <w:t>Responsible Account:</w:t>
       </w:r>
       <w:r>
         <w:t xml:space="preserve"> </w:t>
@@ -1606,72 +1263,68 @@
         <w:rPr>
           <w:rStyle w:val="VerbatimChar"/>
         </w:rPr>
-        <w:t xml:space="preserve">HEALTH_OFFICER</w:t>
+        <w:t>HEALTH_OFFICER</w:t>
       </w:r>
       <w:r>
         <w:t xml:space="preserve"> </w:t>
       </w:r>
-      <w:r>
-        <w:t xml:space="preserve">1. The Health Officer views the</w:t>
-      </w:r>
-      <w:r>
-        <w:t xml:space="preserve"> </w:t>
-      </w:r>
-      <w:r>
-        <w:t xml:space="preserve">“Pending Admissions”</w:t>
-      </w:r>
-      <w:r>
-        <w:t xml:space="preserve"> </w:t>
-      </w:r>
-      <w:r>
-        <w:t xml:space="preserve">queue on their dashboard.</w:t>
-      </w:r>
-      <w:r>
-        <w:t xml:space="preserve"> </w:t>
-      </w:r>
-      <w:r>
-        <w:t xml:space="preserve">2. Selects the newly registered inmate to initiate the</w:t>
-      </w:r>
-      <w:r>
-        <w:t xml:space="preserve"> </w:t>
-      </w:r>
-      <w:r>
-        <w:rPr>
-          <w:b/>
-          <w:bCs/>
-        </w:rPr>
-        <w:t xml:space="preserve">Admission Health Screening</w:t>
-      </w:r>
-      <w:r>
-        <w:t xml:space="preserve">.</w:t>
-      </w:r>
-      <w:r>
-        <w:t xml:space="preserve"> </w:t>
-      </w:r>
-      <w:r>
-        <w:t xml:space="preserve">3. The officer records vital signs (BP, Weight, Temp), logs any chronic illnesses, allergies, and notes physical injuries present upon arrival.</w:t>
-      </w:r>
-      <w:r>
-        <w:t xml:space="preserve"> </w:t>
-      </w:r>
-      <w:r>
-        <w:t xml:space="preserve">4. Saves the assessment. This generates a permanent</w:t>
-      </w:r>
-      <w:r>
-        <w:t xml:space="preserve"> </w:t>
+    </w:p>
+    <w:p>
+      <w:pPr>
+        <w:pStyle w:val="FirstParagraph"/>
+      </w:pPr>
+      <w:r>
+        <w:t xml:space="preserve">1. The Health Officer views the “Pending Admissions” queue on their dashboard. </w:t>
+      </w:r>
+    </w:p>
+    <w:p>
+      <w:pPr>
+        <w:pStyle w:val="FirstParagraph"/>
+      </w:pPr>
+      <w:r>
+        <w:t xml:space="preserve">2. Selects the newly registered inmate to initiate the </w:t>
+      </w:r>
+      <w:r>
+        <w:rPr>
+          <w:b/>
+          <w:bCs/>
+        </w:rPr>
+        <w:t>Admission Health Screening</w:t>
+      </w:r>
+      <w:r>
+        <w:t xml:space="preserve">. </w:t>
+      </w:r>
+    </w:p>
+    <w:p>
+      <w:pPr>
+        <w:pStyle w:val="FirstParagraph"/>
+      </w:pPr>
+      <w:r>
+        <w:t xml:space="preserve">3. The officer records vital signs (BP, Weight, Temp), logs any chronic illnesses, allergies, and notes physical injuries present upon arrival. </w:t>
+      </w:r>
+    </w:p>
+    <w:p>
+      <w:pPr>
+        <w:pStyle w:val="FirstParagraph"/>
+      </w:pPr>
+      <w:r>
+        <w:t xml:space="preserve">4. Saves the assessment. This generates a permanent </w:t>
       </w:r>
       <w:r>
         <w:rPr>
           <w:rStyle w:val="VerbatimChar"/>
         </w:rPr>
-        <w:t xml:space="preserve">Patient</w:t>
-      </w:r>
-      <w:r>
-        <w:t xml:space="preserve"> </w:t>
-      </w:r>
-      <w:r>
-        <w:t xml:space="preserve">record linked to the Inmate.</w:t>
-      </w:r>
+        <w:t>Patient</w:t>
+      </w:r>
+      <w:r>
+        <w:t xml:space="preserve"> record linked to the Inmate.</w:t>
+      </w:r>
+    </w:p>
+    <w:p>
+      <w:pPr>
+        <w:pStyle w:val="BodyText"/>
+        <w:spacing w:before="180" w:after="180"/>
+      </w:pPr>
     </w:p>
     <w:bookmarkEnd w:id="20"/>
     <w:bookmarkStart w:id="21" w:name="inmate-admission-approval"/>
@@ -1680,19 +1333,19 @@
         <w:pStyle w:val="Heading3"/>
       </w:pPr>
       <w:r>
-        <w:t xml:space="preserve">4.4 Inmate Admission Approval</w:t>
-      </w:r>
-    </w:p>
-    <w:p>
-      <w:pPr>
-        <w:pStyle w:val="FirstParagraph"/>
-      </w:pPr>
-      <w:r>
-        <w:rPr>
-          <w:b/>
-          <w:bCs/>
-        </w:rPr>
-        <w:t xml:space="preserve">Responsible Account:</w:t>
+        <w:t>4.4 Inmate Admission Approval</w:t>
+      </w:r>
+    </w:p>
+    <w:p>
+      <w:pPr>
+        <w:pStyle w:val="FirstParagraph"/>
+      </w:pPr>
+      <w:r>
+        <w:rPr>
+          <w:b/>
+          <w:bCs/>
+        </w:rPr>
+        <w:t>Responsible Account:</w:t>
       </w:r>
       <w:r>
         <w:t xml:space="preserve"> </w:t>
@@ -1701,102 +1354,72 @@
         <w:rPr>
           <w:rStyle w:val="VerbatimChar"/>
         </w:rPr>
-        <w:t xml:space="preserve">ADMIN_OFFICER</w:t>
-      </w:r>
-      <w:r>
-        <w:t xml:space="preserve"> </w:t>
-      </w:r>
-      <w:r>
-        <w:t xml:space="preserve">(Station Admin) or Senior Receptionist.</w:t>
-      </w:r>
-      <w:r>
-        <w:t xml:space="preserve"> </w:t>
-      </w:r>
-      <w:r>
-        <w:t xml:space="preserve">1. The Admin reviews the unified</w:t>
-      </w:r>
-      <w:r>
-        <w:t xml:space="preserve"> </w:t>
-      </w:r>
-      <w:r>
-        <w:rPr>
-          <w:b/>
-          <w:bCs/>
-        </w:rPr>
-        <w:t xml:space="preserve">Admission Dossier</w:t>
-      </w:r>
-      <w:r>
-        <w:t xml:space="preserve">, which aggregates:</w:t>
-      </w:r>
-      <w:r>
-        <w:t xml:space="preserve"> </w:t>
-      </w:r>
-      <w:r>
-        <w:t xml:space="preserve">* Basic Registration Data</w:t>
-      </w:r>
-      <w:r>
-        <w:t xml:space="preserve"> </w:t>
-      </w:r>
-      <w:r>
-        <w:t xml:space="preserve">* Offence &amp; Legal Data</w:t>
-      </w:r>
-      <w:r>
-        <w:t xml:space="preserve"> </w:t>
-      </w:r>
-      <w:r>
-        <w:t xml:space="preserve">* Initial Health Assessment</w:t>
-      </w:r>
-      <w:r>
-        <w:t xml:space="preserve"> </w:t>
-      </w:r>
-      <w:r>
-        <w:t xml:space="preserve">2. If all data is accurate and compliant, the Admin clicks</w:t>
-      </w:r>
-      <w:r>
-        <w:t xml:space="preserve"> </w:t>
-      </w:r>
-      <w:r>
-        <w:rPr>
-          <w:b/>
-          <w:bCs/>
-        </w:rPr>
-        <w:t xml:space="preserve">Approve Admission</w:t>
-      </w:r>
-      <w:r>
-        <w:t xml:space="preserve">.</w:t>
-      </w:r>
-      <w:r>
-        <w:t xml:space="preserve"> </w:t>
-      </w:r>
-      <w:r>
-        <w:t xml:space="preserve">3. The inmate’s state transitions from</w:t>
-      </w:r>
-      <w:r>
-        <w:t xml:space="preserve"> </w:t>
+        <w:t>ADMIN_OFFICER</w:t>
+      </w:r>
+      <w:r>
+        <w:t xml:space="preserve"> (Station Admin) or Senior Receptionist. </w:t>
+      </w:r>
+    </w:p>
+    <w:p>
+      <w:pPr>
+        <w:pStyle w:val="FirstParagraph"/>
+      </w:pPr>
+      <w:r>
+        <w:t xml:space="preserve">1. The Admin reviews the unified </w:t>
+      </w:r>
+      <w:r>
+        <w:rPr>
+          <w:b/>
+          <w:bCs/>
+        </w:rPr>
+        <w:t>Admission Dossier</w:t>
+      </w:r>
+      <w:r>
+        <w:t xml:space="preserve">, which aggregates: * Basic Registration Data * Offence &amp; Legal Data * Initial Health Assessment </w:t>
+      </w:r>
+    </w:p>
+    <w:p>
+      <w:pPr>
+        <w:pStyle w:val="FirstParagraph"/>
+      </w:pPr>
+      <w:r>
+        <w:t xml:space="preserve">2. If all data is accurate and compliant, the Admin clicks </w:t>
+      </w:r>
+      <w:r>
+        <w:rPr>
+          <w:b/>
+          <w:bCs/>
+        </w:rPr>
+        <w:t>Approve Admission</w:t>
+      </w:r>
+      <w:r>
+        <w:t xml:space="preserve">. </w:t>
+      </w:r>
+    </w:p>
+    <w:p>
+      <w:pPr>
+        <w:pStyle w:val="FirstParagraph"/>
+      </w:pPr>
+      <w:r>
+        <w:t xml:space="preserve">3. The inmate’s state transitions from </w:t>
       </w:r>
       <w:r>
         <w:rPr>
           <w:rStyle w:val="VerbatimChar"/>
         </w:rPr>
-        <w:t xml:space="preserve">PENDING</w:t>
-      </w:r>
-      <w:r>
-        <w:t xml:space="preserve"> </w:t>
-      </w:r>
-      <w:r>
-        <w:t xml:space="preserve">to</w:t>
-      </w:r>
-      <w:r>
-        <w:t xml:space="preserve"> </w:t>
+        <w:t>PENDING</w:t>
+      </w:r>
+      <w:r>
+        <w:t xml:space="preserve"> to </w:t>
       </w:r>
       <w:r>
         <w:rPr>
           <w:rStyle w:val="VerbatimChar"/>
         </w:rPr>
-        <w:t xml:space="preserve">ACTIVE</w:t>
-      </w:r>
-      <w:r>
-        <w:t xml:space="preserve">. They are officially part of the station’s active population.</w:t>
+        <w:t>ACTIVE</w:t>
+      </w:r>
+      <w:r>
+        <w:t>. They are officially part of the station’s active population.</w:t>
       </w:r>
     </w:p>
     <w:bookmarkEnd w:id="21"/>
@@ -1806,119 +1429,97 @@
         <w:pStyle w:val="Heading3"/>
       </w:pPr>
       <w:r>
-        <w:t xml:space="preserve">4.5 Inmate Reclassification Workflow</w:t>
-      </w:r>
-    </w:p>
-    <w:p>
-      <w:pPr>
-        <w:pStyle w:val="FirstParagraph"/>
-      </w:pPr>
-      <w:r>
-        <w:t xml:space="preserve">Over time, an inmate’s behavior or legal status may change, necessitating a reclassification (e.g., moving from High Risk to Medium Risk).</w:t>
-      </w:r>
-      <w:r>
-        <w:t xml:space="preserve"> </w:t>
-      </w:r>
-      <w:r>
-        <w:t xml:space="preserve">1. A</w:t>
-      </w:r>
-      <w:r>
-        <w:t xml:space="preserve"> </w:t>
-      </w:r>
-      <w:r>
-        <w:rPr>
-          <w:b/>
-          <w:bCs/>
-        </w:rPr>
-        <w:t xml:space="preserve">Security Officer</w:t>
-      </w:r>
-      <w:r>
-        <w:t xml:space="preserve"> </w:t>
-      </w:r>
-      <w:r>
-        <w:t xml:space="preserve">or</w:t>
-      </w:r>
-      <w:r>
-        <w:t xml:space="preserve"> </w:t>
-      </w:r>
-      <w:r>
-        <w:rPr>
-          <w:b/>
-          <w:bCs/>
-        </w:rPr>
-        <w:t xml:space="preserve">Reception Officer</w:t>
-      </w:r>
-      <w:r>
-        <w:t xml:space="preserve"> </w:t>
-      </w:r>
-      <w:r>
-        <w:t xml:space="preserve">navigates to the Inmate’s profile and clicks</w:t>
-      </w:r>
-      <w:r>
-        <w:t xml:space="preserve"> </w:t>
-      </w:r>
-      <w:r>
-        <w:rPr>
-          <w:b/>
-          <w:bCs/>
-        </w:rPr>
-        <w:t xml:space="preserve">Propose Reclassification</w:t>
-      </w:r>
-      <w:r>
-        <w:t xml:space="preserve">.</w:t>
-      </w:r>
-      <w:r>
-        <w:t xml:space="preserve"> </w:t>
-      </w:r>
-      <w:r>
-        <w:t xml:space="preserve">2. Enters the new proposed class and attaches a mandatory justification (e.g.,</w:t>
-      </w:r>
-      <w:r>
-        <w:t xml:space="preserve"> </w:t>
-      </w:r>
-      <w:r>
-        <w:t xml:space="preserve">“Good behavior over 24 months”</w:t>
-      </w:r>
-      <w:r>
-        <w:t xml:space="preserve">).</w:t>
-      </w:r>
-      <w:r>
-        <w:t xml:space="preserve"> </w:t>
-      </w:r>
-      <w:r>
-        <w:t xml:space="preserve">3. The request is routed to the</w:t>
-      </w:r>
-      <w:r>
-        <w:t xml:space="preserve"> </w:t>
-      </w:r>
-      <w:r>
-        <w:rPr>
-          <w:b/>
-          <w:bCs/>
-        </w:rPr>
-        <w:t xml:space="preserve">Station Admin</w:t>
-      </w:r>
-      <w:r>
-        <w:t xml:space="preserve">.</w:t>
-      </w:r>
-      <w:r>
-        <w:t xml:space="preserve"> </w:t>
-      </w:r>
-      <w:r>
-        <w:t xml:space="preserve">4. The Admin reviews the justification, checks disciplinary records, and clicks</w:t>
-      </w:r>
-      <w:r>
-        <w:t xml:space="preserve"> </w:t>
-      </w:r>
-      <w:r>
-        <w:rPr>
-          <w:b/>
-          <w:bCs/>
-        </w:rPr>
-        <w:t xml:space="preserve">Approve Reclassification</w:t>
-      </w:r>
-      <w:r>
-        <w:t xml:space="preserve">. The system logs the change in the audit trail.</w:t>
+        <w:t>4.5 Inmate Reclassification Workflow</w:t>
+      </w:r>
+    </w:p>
+    <w:p>
+      <w:pPr>
+        <w:pStyle w:val="FirstParagraph"/>
+      </w:pPr>
+      <w:r>
+        <w:t xml:space="preserve">Over time, an inmate’s behavior or legal status may change, necessitating a reclassification (e.g., moving from High Risk to Medium Risk). </w:t>
+      </w:r>
+    </w:p>
+    <w:p>
+      <w:pPr>
+        <w:pStyle w:val="FirstParagraph"/>
+      </w:pPr>
+      <w:r>
+        <w:t xml:space="preserve">1. A </w:t>
+      </w:r>
+      <w:r>
+        <w:rPr>
+          <w:b/>
+          <w:bCs/>
+        </w:rPr>
+        <w:t>Security Officer</w:t>
+      </w:r>
+      <w:r>
+        <w:t xml:space="preserve"> or </w:t>
+      </w:r>
+      <w:r>
+        <w:rPr>
+          <w:b/>
+          <w:bCs/>
+        </w:rPr>
+        <w:t>Reception Officer</w:t>
+      </w:r>
+      <w:r>
+        <w:t xml:space="preserve"> navigates to the Inmate’s profile and clicks </w:t>
+      </w:r>
+      <w:r>
+        <w:rPr>
+          <w:b/>
+          <w:bCs/>
+        </w:rPr>
+        <w:t>Propose Reclassification</w:t>
+      </w:r>
+      <w:r>
+        <w:t xml:space="preserve">. </w:t>
+      </w:r>
+    </w:p>
+    <w:p>
+      <w:pPr>
+        <w:pStyle w:val="FirstParagraph"/>
+      </w:pPr>
+      <w:r>
+        <w:t xml:space="preserve">2. Enters the new proposed class and attaches a mandatory justification (e.g., “Good behavior over 24 months”). </w:t>
+      </w:r>
+    </w:p>
+    <w:p>
+      <w:pPr>
+        <w:pStyle w:val="FirstParagraph"/>
+      </w:pPr>
+      <w:r>
+        <w:t xml:space="preserve">3. The request is routed to the </w:t>
+      </w:r>
+      <w:r>
+        <w:rPr>
+          <w:b/>
+          <w:bCs/>
+        </w:rPr>
+        <w:t>Station Admin</w:t>
+      </w:r>
+      <w:r>
+        <w:t xml:space="preserve">. </w:t>
+      </w:r>
+    </w:p>
+    <w:p>
+      <w:pPr>
+        <w:pStyle w:val="FirstParagraph"/>
+      </w:pPr>
+      <w:r>
+        <w:t xml:space="preserve">4. The Admin reviews the justification, checks disciplinary records, and clicks </w:t>
+      </w:r>
+      <w:r>
+        <w:rPr>
+          <w:b/>
+          <w:bCs/>
+        </w:rPr>
+        <w:t>Approve Reclassification</w:t>
+      </w:r>
+      <w:r>
+        <w:t>. The system logs the change in the audit trail.</w:t>
       </w:r>
     </w:p>
     <w:bookmarkEnd w:id="22"/>
@@ -1928,134 +1529,114 @@
         <w:pStyle w:val="Heading3"/>
       </w:pPr>
       <w:r>
-        <w:t xml:space="preserve">4.6 Discharge of an Inmate</w:t>
-      </w:r>
-    </w:p>
-    <w:p>
-      <w:pPr>
-        <w:pStyle w:val="FirstParagraph"/>
-      </w:pPr>
-      <w:r>
-        <w:t xml:space="preserve">When an inmate reaches their Release Date, or is granted bail/pardon:</w:t>
-      </w:r>
-      <w:r>
-        <w:t xml:space="preserve"> </w:t>
-      </w:r>
-      <w:r>
-        <w:t xml:space="preserve">1.</w:t>
-      </w:r>
-      <w:r>
-        <w:t xml:space="preserve"> </w:t>
-      </w:r>
-      <w:r>
-        <w:rPr>
-          <w:b/>
-          <w:bCs/>
-        </w:rPr>
-        <w:t xml:space="preserve">Reception Officer</w:t>
-      </w:r>
-      <w:r>
-        <w:t xml:space="preserve"> </w:t>
-      </w:r>
-      <w:r>
-        <w:t xml:space="preserve">initiates the</w:t>
-      </w:r>
-      <w:r>
-        <w:t xml:space="preserve"> </w:t>
-      </w:r>
-      <w:r>
-        <w:rPr>
-          <w:b/>
-          <w:bCs/>
-        </w:rPr>
-        <w:t xml:space="preserve">Discharge Workflow</w:t>
-      </w:r>
-      <w:r>
-        <w:t xml:space="preserve">.</w:t>
-      </w:r>
-      <w:r>
-        <w:t xml:space="preserve"> </w:t>
-      </w:r>
-      <w:r>
-        <w:t xml:space="preserve">2.</w:t>
-      </w:r>
-      <w:r>
-        <w:t xml:space="preserve"> </w:t>
-      </w:r>
-      <w:r>
-        <w:rPr>
-          <w:b/>
-          <w:bCs/>
-        </w:rPr>
-        <w:t xml:space="preserve">Health Sign-off:</w:t>
-      </w:r>
-      <w:r>
-        <w:t xml:space="preserve"> </w:t>
-      </w:r>
-      <w:r>
-        <w:t xml:space="preserve">The Health Officer performs a final medical check and clears the patient.</w:t>
-      </w:r>
-      <w:r>
-        <w:t xml:space="preserve"> </w:t>
-      </w:r>
-      <w:r>
-        <w:t xml:space="preserve">3.</w:t>
-      </w:r>
-      <w:r>
-        <w:t xml:space="preserve"> </w:t>
-      </w:r>
-      <w:r>
-        <w:rPr>
-          <w:b/>
-          <w:bCs/>
-        </w:rPr>
-        <w:t xml:space="preserve">Valuables Return:</w:t>
-      </w:r>
-      <w:r>
-        <w:t xml:space="preserve"> </w:t>
-      </w:r>
-      <w:r>
-        <w:t xml:space="preserve">The Stores/Reception officer returns the logged valuables, capturing a digital signature/thumbprint from the inmate.</w:t>
-      </w:r>
-      <w:r>
-        <w:t xml:space="preserve"> </w:t>
-      </w:r>
-      <w:r>
-        <w:t xml:space="preserve">4.</w:t>
-      </w:r>
-      <w:r>
-        <w:t xml:space="preserve"> </w:t>
-      </w:r>
-      <w:r>
-        <w:rPr>
-          <w:b/>
-          <w:bCs/>
-        </w:rPr>
-        <w:t xml:space="preserve">Final Approval:</w:t>
-      </w:r>
-      <w:r>
-        <w:t xml:space="preserve"> </w:t>
-      </w:r>
-      <w:r>
-        <w:t xml:space="preserve">The Station Admin reviews the discharge dossier and approves.</w:t>
-      </w:r>
-      <w:r>
-        <w:t xml:space="preserve"> </w:t>
-      </w:r>
-      <w:r>
-        <w:t xml:space="preserve">5. The inmate’s state changes to</w:t>
-      </w:r>
-      <w:r>
-        <w:t xml:space="preserve"> </w:t>
+        <w:t>4.6 Discharge of an Inmate</w:t>
+      </w:r>
+    </w:p>
+    <w:p>
+      <w:pPr>
+        <w:pStyle w:val="FirstParagraph"/>
+      </w:pPr>
+      <w:r>
+        <w:t xml:space="preserve">When an inmate reaches their Release Date, or is granted bail/pardon: </w:t>
+      </w:r>
+    </w:p>
+    <w:p>
+      <w:pPr>
+        <w:pStyle w:val="FirstParagraph"/>
+      </w:pPr>
+      <w:r>
+        <w:t xml:space="preserve">1. </w:t>
+      </w:r>
+      <w:r>
+        <w:rPr>
+          <w:b/>
+          <w:bCs/>
+        </w:rPr>
+        <w:t>Reception Officer</w:t>
+      </w:r>
+      <w:r>
+        <w:t xml:space="preserve"> initiates the </w:t>
+      </w:r>
+      <w:r>
+        <w:rPr>
+          <w:b/>
+          <w:bCs/>
+        </w:rPr>
+        <w:t>Discharge Workflow</w:t>
+      </w:r>
+      <w:r>
+        <w:t xml:space="preserve">. </w:t>
+      </w:r>
+    </w:p>
+    <w:p>
+      <w:pPr>
+        <w:pStyle w:val="FirstParagraph"/>
+      </w:pPr>
+      <w:r>
+        <w:t xml:space="preserve">2. </w:t>
+      </w:r>
+      <w:r>
+        <w:rPr>
+          <w:b/>
+          <w:bCs/>
+        </w:rPr>
+        <w:t>Health Sign-off:</w:t>
+      </w:r>
+      <w:r>
+        <w:t xml:space="preserve"> The Health Officer performs a final medical check and clears the patient. </w:t>
+      </w:r>
+    </w:p>
+    <w:p>
+      <w:pPr>
+        <w:pStyle w:val="FirstParagraph"/>
+      </w:pPr>
+      <w:r>
+        <w:t xml:space="preserve">3. </w:t>
+      </w:r>
+      <w:r>
+        <w:rPr>
+          <w:b/>
+          <w:bCs/>
+        </w:rPr>
+        <w:t>Valuables Return:</w:t>
+      </w:r>
+      <w:r>
+        <w:t xml:space="preserve"> The Stores/Reception officer returns the logged valuables, capturing a digital signature/thumbprint from the inmate. </w:t>
+      </w:r>
+    </w:p>
+    <w:p>
+      <w:pPr>
+        <w:pStyle w:val="FirstParagraph"/>
+      </w:pPr>
+      <w:r>
+        <w:t xml:space="preserve">4. </w:t>
+      </w:r>
+      <w:r>
+        <w:rPr>
+          <w:b/>
+          <w:bCs/>
+        </w:rPr>
+        <w:t>Final Approval:</w:t>
+      </w:r>
+      <w:r>
+        <w:t xml:space="preserve"> The Station Admin reviews the discharge dossier and approves. </w:t>
+      </w:r>
+    </w:p>
+    <w:p>
+      <w:pPr>
+        <w:pStyle w:val="FirstParagraph"/>
+      </w:pPr>
+      <w:r>
+        <w:t xml:space="preserve">5. The inmate’s state changes to </w:t>
       </w:r>
       <w:r>
         <w:rPr>
           <w:rStyle w:val="VerbatimChar"/>
         </w:rPr>
-        <w:t xml:space="preserve">DISCHARGED</w:t>
-      </w:r>
-      <w:r>
-        <w:t xml:space="preserve">. The record is archived but remains accessible for historical reporting and audit purposes.</w:t>
+        <w:t>DISCHARGED</w:t>
+      </w:r>
+      <w:r>
+        <w:t>. The record is archived but remains accessible for historical reporting and audit purposes.</w:t>
       </w:r>
     </w:p>
     <w:bookmarkEnd w:id="23"/>

</xml_diff>